<commit_message>
feat: rebuilt reports LR1-LR7 and project summary: headings, citations, text after tables and figures
</commit_message>
<xml_diff>
--- a/ПРОВЕРИТЬ_ОТЧЕТЫ/РЕЗЮМЕ_ПРОЕКТА_NotaCode.docx
+++ b/ПРОВЕРИТЬ_ОТЧЕТЫ/РЕЗЮМЕ_ПРОЕКТА_NotaCode.docx
@@ -5,8 +5,7 @@
     <w:p>
       <w:pPr>
         <w:pStyle w:val="1"/>
-        <w:keepNext/>
-        <w:spacing w:lineRule="exact" w:line="360" w:before="0" w:after="360"/>
+        <w:spacing w:before="0" w:after="360" w:line="360" w:lineRule="exact"/>
         <w:jc w:val="center"/>
       </w:pPr>
       <w:bookmarkStart w:id="0" w:name="_e72c5a3a5b2db55fdd327b62a1d941bcf43f699"/>
@@ -16,16 +15,14 @@
           <w:b/>
           <w:sz w:val="28"/>
         </w:rPr>
-        <w:t>Краткое резюме проекта NotaCode</w:t>
+        <w:t>КРАТКОЕ РЕЗЮМЕ ПРОЕКТА NOTACODE</w:t>
       </w:r>
     </w:p>
     <w:p>
       <w:pPr>
         <w:pStyle w:val="2"/>
-        <w:keepNext/>
-        <w:spacing w:lineRule="exact" w:line="360" w:before="360" w:after="360"/>
+        <w:spacing w:before="360" w:after="360" w:line="360" w:lineRule="exact"/>
         <w:ind w:firstLine="709"/>
-        <w:jc w:val="left"/>
       </w:pPr>
       <w:bookmarkStart w:id="1" w:name="_d83b604e1919d82826d0fd872b96658a1890fb0"/>
       <w:r>
@@ -40,34 +37,32 @@
     <w:tbl>
       <w:tblPr>
         <w:tblStyle w:val="Table"/>
-        <w:tblW w:w="9689" w:type="dxa"/>
+        <w:tblW w:w="9355" w:type="dxa"/>
         <w:tblLayout w:type="fixed"/>
         <w:tblLook w:val="0020" w:firstRow="1" w:lastRow="0" w:firstColumn="0" w:lastColumn="0" w:noHBand="0" w:noVBand="0"/>
       </w:tblPr>
       <w:tblGrid>
-        <w:gridCol w:w="4040"/>
-        <w:gridCol w:w="5649"/>
+        <w:gridCol w:w="2217"/>
+        <w:gridCol w:w="7138"/>
       </w:tblGrid>
       <w:tr>
         <w:trPr>
           <w:cnfStyle w:val="100000000000" w:firstRow="1" w:lastRow="0" w:firstColumn="0" w:lastColumn="0" w:oddVBand="0" w:evenVBand="0" w:oddHBand="0" w:evenHBand="0" w:firstRowFirstColumn="0" w:firstRowLastColumn="0" w:lastRowFirstColumn="0" w:lastRowLastColumn="0"/>
+          <w:cantSplit/>
           <w:tblHeader/>
-          <w:cantSplit/>
         </w:trPr>
         <w:tc>
           <w:tcPr>
-            <w:tcW w:w="4040" w:type="dxa"/>
-          </w:tcPr>
-          <w:p>
-            <w:pPr>
-              <w:pStyle w:val="Compact"/>
-              <w:keepNext/>
-              <w:spacing w:line="240" w:lineRule="auto"/>
-              <w:ind w:firstLine="0"/>
-            </w:pPr>
-            <w:r>
-              <w:rPr>
-                <w:rFonts w:ascii="Times New Roman" w:hAnsi="Times New Roman"/>
+            <w:tcW w:w="2217" w:type="dxa"/>
+          </w:tcPr>
+          <w:p>
+            <w:pPr>
+              <w:pStyle w:val="Compact"/>
+              <w:keepNext/>
+              <w:spacing w:before="0" w:after="0"/>
+            </w:pPr>
+            <w:r>
+              <w:rPr>
                 <w:sz w:val="24"/>
               </w:rPr>
               <w:t>Параметр</w:t>
@@ -76,18 +71,16 @@
         </w:tc>
         <w:tc>
           <w:tcPr>
-            <w:tcW w:w="5649" w:type="dxa"/>
-          </w:tcPr>
-          <w:p>
-            <w:pPr>
-              <w:pStyle w:val="Compact"/>
-              <w:keepNext/>
-              <w:spacing w:line="240" w:lineRule="auto"/>
-              <w:ind w:firstLine="0"/>
-            </w:pPr>
-            <w:r>
-              <w:rPr>
-                <w:rFonts w:ascii="Times New Roman" w:hAnsi="Times New Roman"/>
+            <w:tcW w:w="7137" w:type="dxa"/>
+          </w:tcPr>
+          <w:p>
+            <w:pPr>
+              <w:pStyle w:val="Compact"/>
+              <w:keepNext/>
+              <w:spacing w:before="0" w:after="0"/>
+            </w:pPr>
+            <w:r>
+              <w:rPr>
                 <w:sz w:val="24"/>
               </w:rPr>
               <w:t>Значение</w:t>
@@ -101,18 +94,16 @@
         </w:trPr>
         <w:tc>
           <w:tcPr>
-            <w:tcW w:w="4040" w:type="dxa"/>
-          </w:tcPr>
-          <w:p>
-            <w:pPr>
-              <w:pStyle w:val="Compact"/>
-              <w:keepNext/>
-              <w:spacing w:line="240" w:lineRule="auto"/>
-              <w:ind w:firstLine="0"/>
-            </w:pPr>
-            <w:r>
-              <w:rPr>
-                <w:rFonts w:ascii="Times New Roman" w:hAnsi="Times New Roman"/>
+            <w:tcW w:w="2217" w:type="dxa"/>
+          </w:tcPr>
+          <w:p>
+            <w:pPr>
+              <w:pStyle w:val="Compact"/>
+              <w:keepNext/>
+              <w:spacing w:before="0" w:after="0"/>
+            </w:pPr>
+            <w:r>
+              <w:rPr>
                 <w:sz w:val="24"/>
               </w:rPr>
               <w:t>Название проекта</w:t>
@@ -121,18 +112,16 @@
         </w:tc>
         <w:tc>
           <w:tcPr>
-            <w:tcW w:w="5649" w:type="dxa"/>
-          </w:tcPr>
-          <w:p>
-            <w:pPr>
-              <w:pStyle w:val="Compact"/>
-              <w:keepNext/>
-              <w:spacing w:line="240" w:lineRule="auto"/>
-              <w:ind w:firstLine="0"/>
-            </w:pPr>
-            <w:r>
-              <w:rPr>
-                <w:rFonts w:ascii="Times New Roman" w:hAnsi="Times New Roman"/>
+            <w:tcW w:w="7137" w:type="dxa"/>
+          </w:tcPr>
+          <w:p>
+            <w:pPr>
+              <w:pStyle w:val="Compact"/>
+              <w:keepNext/>
+              <w:spacing w:before="0" w:after="0"/>
+            </w:pPr>
+            <w:r>
+              <w:rPr>
                 <w:sz w:val="24"/>
               </w:rPr>
               <w:t>NotaCode</w:t>
@@ -146,17 +135,16 @@
         </w:trPr>
         <w:tc>
           <w:tcPr>
-            <w:tcW w:w="4040" w:type="dxa"/>
-          </w:tcPr>
-          <w:p>
-            <w:pPr>
-              <w:pStyle w:val="Compact"/>
-              <w:spacing w:line="240" w:lineRule="auto"/>
-              <w:ind w:firstLine="0"/>
-            </w:pPr>
-            <w:r>
-              <w:rPr>
-                <w:rFonts w:ascii="Times New Roman" w:hAnsi="Times New Roman"/>
+            <w:tcW w:w="2217" w:type="dxa"/>
+          </w:tcPr>
+          <w:p>
+            <w:pPr>
+              <w:pStyle w:val="Compact"/>
+              <w:keepNext/>
+              <w:spacing w:before="0" w:after="0"/>
+            </w:pPr>
+            <w:r>
+              <w:rPr>
                 <w:sz w:val="24"/>
               </w:rPr>
               <w:t>Инициатор / владелец</w:t>
@@ -165,17 +153,16 @@
         </w:tc>
         <w:tc>
           <w:tcPr>
-            <w:tcW w:w="5649" w:type="dxa"/>
-          </w:tcPr>
-          <w:p>
-            <w:pPr>
-              <w:pStyle w:val="Compact"/>
-              <w:spacing w:line="240" w:lineRule="auto"/>
-              <w:ind w:firstLine="0"/>
-            </w:pPr>
-            <w:r>
-              <w:rPr>
-                <w:rFonts w:ascii="Times New Roman" w:hAnsi="Times New Roman"/>
+            <w:tcW w:w="7137" w:type="dxa"/>
+          </w:tcPr>
+          <w:p>
+            <w:pPr>
+              <w:pStyle w:val="Compact"/>
+              <w:keepNext/>
+              <w:spacing w:before="0" w:after="0"/>
+            </w:pPr>
+            <w:r>
+              <w:rPr>
                 <w:sz w:val="24"/>
               </w:rPr>
               <w:t>К. А. Хаджинова, группа 60131, БГУИР</w:t>
@@ -189,17 +176,16 @@
         </w:trPr>
         <w:tc>
           <w:tcPr>
-            <w:tcW w:w="4040" w:type="dxa"/>
-          </w:tcPr>
-          <w:p>
-            <w:pPr>
-              <w:pStyle w:val="Compact"/>
-              <w:spacing w:line="240" w:lineRule="auto"/>
-              <w:ind w:firstLine="0"/>
-            </w:pPr>
-            <w:r>
-              <w:rPr>
-                <w:rFonts w:ascii="Times New Roman" w:hAnsi="Times New Roman"/>
+            <w:tcW w:w="2217" w:type="dxa"/>
+          </w:tcPr>
+          <w:p>
+            <w:pPr>
+              <w:pStyle w:val="Compact"/>
+              <w:keepNext/>
+              <w:spacing w:before="0" w:after="0"/>
+            </w:pPr>
+            <w:r>
+              <w:rPr>
                 <w:sz w:val="24"/>
               </w:rPr>
               <w:t>Суть проекта в 1 предложении</w:t>
@@ -208,17 +194,16 @@
         </w:tc>
         <w:tc>
           <w:tcPr>
-            <w:tcW w:w="5649" w:type="dxa"/>
-          </w:tcPr>
-          <w:p>
-            <w:pPr>
-              <w:pStyle w:val="Compact"/>
-              <w:spacing w:line="240" w:lineRule="auto"/>
-              <w:ind w:firstLine="0"/>
-            </w:pPr>
-            <w:r>
-              <w:rPr>
-                <w:rFonts w:ascii="Times New Roman" w:hAnsi="Times New Roman"/>
+            <w:tcW w:w="7137" w:type="dxa"/>
+          </w:tcPr>
+          <w:p>
+            <w:pPr>
+              <w:pStyle w:val="Compact"/>
+              <w:keepNext/>
+              <w:spacing w:before="0" w:after="0"/>
+            </w:pPr>
+            <w:r>
+              <w:rPr>
                 <w:sz w:val="24"/>
               </w:rPr>
               <w:t>Проект создает веб-IDE «диаграммы как код» для студентов технических специальностей и аналитиков ПО, чтобы решить проблему отсутствия единого инструмента для всех нотаций проекта за счет единого редактора с текстовым вводом.</w:t>
@@ -232,17 +217,16 @@
         </w:trPr>
         <w:tc>
           <w:tcPr>
-            <w:tcW w:w="4040" w:type="dxa"/>
-          </w:tcPr>
-          <w:p>
-            <w:pPr>
-              <w:pStyle w:val="Compact"/>
-              <w:spacing w:line="240" w:lineRule="auto"/>
-              <w:ind w:firstLine="0"/>
-            </w:pPr>
-            <w:r>
-              <w:rPr>
-                <w:rFonts w:ascii="Times New Roman" w:hAnsi="Times New Roman"/>
+            <w:tcW w:w="2217" w:type="dxa"/>
+          </w:tcPr>
+          <w:p>
+            <w:pPr>
+              <w:pStyle w:val="Compact"/>
+              <w:keepNext/>
+              <w:spacing w:before="0" w:after="0"/>
+            </w:pPr>
+            <w:r>
+              <w:rPr>
                 <w:sz w:val="24"/>
               </w:rPr>
               <w:t>Запрашиваемое решение</w:t>
@@ -251,17 +235,16 @@
         </w:tc>
         <w:tc>
           <w:tcPr>
-            <w:tcW w:w="5649" w:type="dxa"/>
-          </w:tcPr>
-          <w:p>
-            <w:pPr>
-              <w:pStyle w:val="Compact"/>
-              <w:spacing w:line="240" w:lineRule="auto"/>
-              <w:ind w:firstLine="0"/>
-            </w:pPr>
-            <w:r>
-              <w:rPr>
-                <w:rFonts w:ascii="Times New Roman" w:hAnsi="Times New Roman"/>
+            <w:tcW w:w="7137" w:type="dxa"/>
+          </w:tcPr>
+          <w:p>
+            <w:pPr>
+              <w:pStyle w:val="Compact"/>
+              <w:keepNext/>
+              <w:spacing w:before="0" w:after="0"/>
+            </w:pPr>
+            <w:r>
+              <w:rPr>
                 <w:sz w:val="24"/>
               </w:rPr>
               <w:t>Рекомендуется пилот (ограниченный старт первого релиза)</w:t>
@@ -275,17 +258,15 @@
         </w:trPr>
         <w:tc>
           <w:tcPr>
-            <w:tcW w:w="4040" w:type="dxa"/>
-          </w:tcPr>
-          <w:p>
-            <w:pPr>
-              <w:pStyle w:val="Compact"/>
-              <w:spacing w:line="240" w:lineRule="auto"/>
-              <w:ind w:firstLine="0"/>
-            </w:pPr>
-            <w:r>
-              <w:rPr>
-                <w:rFonts w:ascii="Times New Roman" w:hAnsi="Times New Roman"/>
+            <w:tcW w:w="2217" w:type="dxa"/>
+          </w:tcPr>
+          <w:p>
+            <w:pPr>
+              <w:pStyle w:val="Compact"/>
+              <w:spacing w:before="0" w:after="0"/>
+            </w:pPr>
+            <w:r>
+              <w:rPr>
                 <w:sz w:val="24"/>
               </w:rPr>
               <w:t>Граница первого старта</w:t>
@@ -294,17 +275,15 @@
         </w:tc>
         <w:tc>
           <w:tcPr>
-            <w:tcW w:w="5649" w:type="dxa"/>
-          </w:tcPr>
-          <w:p>
-            <w:pPr>
-              <w:pStyle w:val="Compact"/>
-              <w:spacing w:line="240" w:lineRule="auto"/>
-              <w:ind w:firstLine="0"/>
-            </w:pPr>
-            <w:r>
-              <w:rPr>
-                <w:rFonts w:ascii="Times New Roman" w:hAnsi="Times New Roman"/>
+            <w:tcW w:w="7137" w:type="dxa"/>
+          </w:tcPr>
+          <w:p>
+            <w:pPr>
+              <w:pStyle w:val="Compact"/>
+              <w:spacing w:before="0" w:after="0"/>
+            </w:pPr>
+            <w:r>
+              <w:rPr>
                 <w:sz w:val="24"/>
               </w:rPr>
               <w:t>Республика Беларусь; студенты вузов; поиск и вузы как каналы; Free и Pro 40 USD в год</w:t>
@@ -316,10 +295,8 @@
     <w:p>
       <w:pPr>
         <w:pStyle w:val="2"/>
-        <w:keepNext/>
-        <w:spacing w:lineRule="exact" w:line="360" w:before="360" w:after="360"/>
+        <w:spacing w:before="360" w:after="360" w:line="360" w:lineRule="exact"/>
         <w:ind w:firstLine="709"/>
-        <w:jc w:val="left"/>
       </w:pPr>
       <w:bookmarkStart w:id="2" w:name="_e9c9d472fa7d9f91385f3088f55d242acaee14e"/>
       <w:bookmarkEnd w:id="1"/>
@@ -335,35 +312,33 @@
     <w:tbl>
       <w:tblPr>
         <w:tblStyle w:val="Table"/>
-        <w:tblW w:w="9689" w:type="dxa"/>
+        <w:tblW w:w="9355" w:type="dxa"/>
         <w:tblLayout w:type="fixed"/>
         <w:tblLook w:val="0020" w:firstRow="1" w:lastRow="0" w:firstColumn="0" w:lastColumn="0" w:noHBand="0" w:noVBand="0"/>
       </w:tblPr>
       <w:tblGrid>
-        <w:gridCol w:w="2152"/>
-        <w:gridCol w:w="5564"/>
-        <w:gridCol w:w="1973"/>
+        <w:gridCol w:w="1556"/>
+        <w:gridCol w:w="5872"/>
+        <w:gridCol w:w="1927"/>
       </w:tblGrid>
       <w:tr>
         <w:trPr>
           <w:cnfStyle w:val="100000000000" w:firstRow="1" w:lastRow="0" w:firstColumn="0" w:lastColumn="0" w:oddVBand="0" w:evenVBand="0" w:oddHBand="0" w:evenHBand="0" w:firstRowFirstColumn="0" w:firstRowLastColumn="0" w:lastRowFirstColumn="0" w:lastRowLastColumn="0"/>
+          <w:cantSplit/>
           <w:tblHeader/>
-          <w:cantSplit/>
         </w:trPr>
         <w:tc>
           <w:tcPr>
-            <w:tcW w:w="2152" w:type="dxa"/>
-          </w:tcPr>
-          <w:p>
-            <w:pPr>
-              <w:pStyle w:val="Compact"/>
-              <w:keepNext/>
-              <w:spacing w:line="240" w:lineRule="auto"/>
-              <w:ind w:firstLine="0"/>
-            </w:pPr>
-            <w:r>
-              <w:rPr>
-                <w:rFonts w:ascii="Times New Roman" w:hAnsi="Times New Roman"/>
+            <w:tcW w:w="1556" w:type="dxa"/>
+          </w:tcPr>
+          <w:p>
+            <w:pPr>
+              <w:pStyle w:val="Compact"/>
+              <w:keepNext/>
+              <w:spacing w:before="0" w:after="0"/>
+            </w:pPr>
+            <w:r>
+              <w:rPr>
                 <w:sz w:val="24"/>
               </w:rPr>
               <w:t>Блок</w:t>
@@ -372,18 +347,16 @@
         </w:tc>
         <w:tc>
           <w:tcPr>
-            <w:tcW w:w="5564" w:type="dxa"/>
-          </w:tcPr>
-          <w:p>
-            <w:pPr>
-              <w:pStyle w:val="Compact"/>
-              <w:keepNext/>
-              <w:spacing w:line="240" w:lineRule="auto"/>
-              <w:ind w:firstLine="0"/>
-            </w:pPr>
-            <w:r>
-              <w:rPr>
-                <w:rFonts w:ascii="Times New Roman" w:hAnsi="Times New Roman"/>
+            <w:tcW w:w="5871" w:type="dxa"/>
+          </w:tcPr>
+          <w:p>
+            <w:pPr>
+              <w:pStyle w:val="Compact"/>
+              <w:keepNext/>
+              <w:spacing w:before="0" w:after="0"/>
+            </w:pPr>
+            <w:r>
+              <w:rPr>
                 <w:sz w:val="24"/>
               </w:rPr>
               <w:t>Краткая запись</w:t>
@@ -392,18 +365,16 @@
         </w:tc>
         <w:tc>
           <w:tcPr>
-            <w:tcW w:w="1973" w:type="dxa"/>
-          </w:tcPr>
-          <w:p>
-            <w:pPr>
-              <w:pStyle w:val="Compact"/>
-              <w:keepNext/>
-              <w:spacing w:line="240" w:lineRule="auto"/>
-              <w:ind w:firstLine="0"/>
-            </w:pPr>
-            <w:r>
-              <w:rPr>
-                <w:rFonts w:ascii="Times New Roman" w:hAnsi="Times New Roman"/>
+            <w:tcW w:w="1927" w:type="dxa"/>
+          </w:tcPr>
+          <w:p>
+            <w:pPr>
+              <w:pStyle w:val="Compact"/>
+              <w:keepNext/>
+              <w:spacing w:before="0" w:after="0"/>
+            </w:pPr>
+            <w:r>
+              <w:rPr>
                 <w:sz w:val="24"/>
               </w:rPr>
               <w:t>Источник</w:t>
@@ -417,18 +388,16 @@
         </w:trPr>
         <w:tc>
           <w:tcPr>
-            <w:tcW w:w="2152" w:type="dxa"/>
-          </w:tcPr>
-          <w:p>
-            <w:pPr>
-              <w:pStyle w:val="Compact"/>
-              <w:keepNext/>
-              <w:spacing w:line="240" w:lineRule="auto"/>
-              <w:ind w:firstLine="0"/>
-            </w:pPr>
-            <w:r>
-              <w:rPr>
-                <w:rFonts w:ascii="Times New Roman" w:hAnsi="Times New Roman"/>
+            <w:tcW w:w="1556" w:type="dxa"/>
+          </w:tcPr>
+          <w:p>
+            <w:pPr>
+              <w:pStyle w:val="Compact"/>
+              <w:keepNext/>
+              <w:spacing w:before="0" w:after="0"/>
+            </w:pPr>
+            <w:r>
+              <w:rPr>
                 <w:sz w:val="24"/>
               </w:rPr>
               <w:t>Идея</w:t>
@@ -437,18 +406,16 @@
         </w:tc>
         <w:tc>
           <w:tcPr>
-            <w:tcW w:w="5564" w:type="dxa"/>
-          </w:tcPr>
-          <w:p>
-            <w:pPr>
-              <w:pStyle w:val="Compact"/>
-              <w:keepNext/>
-              <w:spacing w:line="240" w:lineRule="auto"/>
-              <w:ind w:firstLine="0"/>
-            </w:pPr>
-            <w:r>
-              <w:rPr>
-                <w:rFonts w:ascii="Times New Roman" w:hAnsi="Times New Roman"/>
+            <w:tcW w:w="5871" w:type="dxa"/>
+          </w:tcPr>
+          <w:p>
+            <w:pPr>
+              <w:pStyle w:val="Compact"/>
+              <w:keepNext/>
+              <w:spacing w:before="0" w:after="0"/>
+            </w:pPr>
+            <w:r>
+              <w:rPr>
                 <w:sz w:val="24"/>
               </w:rPr>
               <w:t>Диаграммы IDEF0, DFD, сетей Петри не поддерживаются 8 просмотренными конкурентами; UML, BPMN и ERD вместе есть только у платного Lucidchart</w:t>
@@ -457,18 +424,16 @@
         </w:tc>
         <w:tc>
           <w:tcPr>
-            <w:tcW w:w="1973" w:type="dxa"/>
-          </w:tcPr>
-          <w:p>
-            <w:pPr>
-              <w:pStyle w:val="Compact"/>
-              <w:keepNext/>
-              <w:spacing w:line="240" w:lineRule="auto"/>
-              <w:ind w:firstLine="0"/>
-            </w:pPr>
-            <w:r>
-              <w:rPr>
-                <w:rFonts w:ascii="Times New Roman" w:hAnsi="Times New Roman"/>
+            <w:tcW w:w="1927" w:type="dxa"/>
+          </w:tcPr>
+          <w:p>
+            <w:pPr>
+              <w:pStyle w:val="Compact"/>
+              <w:keepNext/>
+              <w:spacing w:before="0" w:after="0"/>
+            </w:pPr>
+            <w:r>
+              <w:rPr>
                 <w:sz w:val="24"/>
               </w:rPr>
               <w:t>ЛР5</w:t>
@@ -482,17 +447,16 @@
         </w:trPr>
         <w:tc>
           <w:tcPr>
-            <w:tcW w:w="2152" w:type="dxa"/>
-          </w:tcPr>
-          <w:p>
-            <w:pPr>
-              <w:pStyle w:val="Compact"/>
-              <w:spacing w:line="240" w:lineRule="auto"/>
-              <w:ind w:firstLine="0"/>
-            </w:pPr>
-            <w:r>
-              <w:rPr>
-                <w:rFonts w:ascii="Times New Roman" w:hAnsi="Times New Roman"/>
+            <w:tcW w:w="1556" w:type="dxa"/>
+          </w:tcPr>
+          <w:p>
+            <w:pPr>
+              <w:pStyle w:val="Compact"/>
+              <w:keepNext/>
+              <w:spacing w:before="0" w:after="0"/>
+            </w:pPr>
+            <w:r>
+              <w:rPr>
                 <w:sz w:val="24"/>
               </w:rPr>
               <w:t>Спрос</w:t>
@@ -501,17 +465,16 @@
         </w:tc>
         <w:tc>
           <w:tcPr>
-            <w:tcW w:w="5564" w:type="dxa"/>
-          </w:tcPr>
-          <w:p>
-            <w:pPr>
-              <w:pStyle w:val="Compact"/>
-              <w:spacing w:line="240" w:lineRule="auto"/>
-              <w:ind w:firstLine="0"/>
-            </w:pPr>
-            <w:r>
-              <w:rPr>
-                <w:rFonts w:ascii="Times New Roman" w:hAnsi="Times New Roman"/>
+            <w:tcW w:w="5871" w:type="dxa"/>
+          </w:tcPr>
+          <w:p>
+            <w:pPr>
+              <w:pStyle w:val="Compact"/>
+              <w:keepNext/>
+              <w:spacing w:before="0" w:after="0"/>
+            </w:pPr>
+            <w:r>
+              <w:rPr>
                 <w:sz w:val="24"/>
               </w:rPr>
               <w:t>UML – 591, BPMN – 476 запросов в месяц; спрос сезонный, снижается на 43–47 % за два года, 73–77 % – Минск и область</w:t>
@@ -520,17 +483,16 @@
         </w:tc>
         <w:tc>
           <w:tcPr>
-            <w:tcW w:w="1973" w:type="dxa"/>
-          </w:tcPr>
-          <w:p>
-            <w:pPr>
-              <w:pStyle w:val="Compact"/>
-              <w:spacing w:line="240" w:lineRule="auto"/>
-              <w:ind w:firstLine="0"/>
-            </w:pPr>
-            <w:r>
-              <w:rPr>
-                <w:rFonts w:ascii="Times New Roman" w:hAnsi="Times New Roman"/>
+            <w:tcW w:w="1927" w:type="dxa"/>
+          </w:tcPr>
+          <w:p>
+            <w:pPr>
+              <w:pStyle w:val="Compact"/>
+              <w:keepNext/>
+              <w:spacing w:before="0" w:after="0"/>
+            </w:pPr>
+            <w:r>
+              <w:rPr>
                 <w:sz w:val="24"/>
               </w:rPr>
               <w:t>ЛР1, Вордстат, Google Trends</w:t>
@@ -544,17 +506,16 @@
         </w:trPr>
         <w:tc>
           <w:tcPr>
-            <w:tcW w:w="2152" w:type="dxa"/>
-          </w:tcPr>
-          <w:p>
-            <w:pPr>
-              <w:pStyle w:val="Compact"/>
-              <w:spacing w:line="240" w:lineRule="auto"/>
-              <w:ind w:firstLine="0"/>
-            </w:pPr>
-            <w:r>
-              <w:rPr>
-                <w:rFonts w:ascii="Times New Roman" w:hAnsi="Times New Roman"/>
+            <w:tcW w:w="1556" w:type="dxa"/>
+          </w:tcPr>
+          <w:p>
+            <w:pPr>
+              <w:pStyle w:val="Compact"/>
+              <w:keepNext/>
+              <w:spacing w:before="0" w:after="0"/>
+            </w:pPr>
+            <w:r>
+              <w:rPr>
                 <w:sz w:val="24"/>
               </w:rPr>
               <w:t>Границы рынка</w:t>
@@ -563,17 +524,16 @@
         </w:tc>
         <w:tc>
           <w:tcPr>
-            <w:tcW w:w="5564" w:type="dxa"/>
-          </w:tcPr>
-          <w:p>
-            <w:pPr>
-              <w:pStyle w:val="Compact"/>
-              <w:spacing w:line="240" w:lineRule="auto"/>
-              <w:ind w:firstLine="0"/>
-            </w:pPr>
-            <w:r>
-              <w:rPr>
-                <w:rFonts w:ascii="Times New Roman" w:hAnsi="Times New Roman"/>
+            <w:tcW w:w="5871" w:type="dxa"/>
+          </w:tcPr>
+          <w:p>
+            <w:pPr>
+              <w:pStyle w:val="Compact"/>
+              <w:keepNext/>
+              <w:spacing w:before="0" w:after="0"/>
+            </w:pPr>
+            <w:r>
+              <w:rPr>
                 <w:sz w:val="24"/>
               </w:rPr>
               <w:t>Студенты и аналитики ПО Беларуси; канал – поиск и вузы</w:t>
@@ -582,17 +542,16 @@
         </w:tc>
         <w:tc>
           <w:tcPr>
-            <w:tcW w:w="1973" w:type="dxa"/>
-          </w:tcPr>
-          <w:p>
-            <w:pPr>
-              <w:pStyle w:val="Compact"/>
-              <w:spacing w:line="240" w:lineRule="auto"/>
-              <w:ind w:firstLine="0"/>
-            </w:pPr>
-            <w:r>
-              <w:rPr>
-                <w:rFonts w:ascii="Times New Roman" w:hAnsi="Times New Roman"/>
+            <w:tcW w:w="1927" w:type="dxa"/>
+          </w:tcPr>
+          <w:p>
+            <w:pPr>
+              <w:pStyle w:val="Compact"/>
+              <w:keepNext/>
+              <w:spacing w:before="0" w:after="0"/>
+            </w:pPr>
+            <w:r>
+              <w:rPr>
                 <w:sz w:val="24"/>
               </w:rPr>
               <w:t>ЛР1</w:t>
@@ -606,17 +565,16 @@
         </w:trPr>
         <w:tc>
           <w:tcPr>
-            <w:tcW w:w="2152" w:type="dxa"/>
-          </w:tcPr>
-          <w:p>
-            <w:pPr>
-              <w:pStyle w:val="Compact"/>
-              <w:spacing w:line="240" w:lineRule="auto"/>
-              <w:ind w:firstLine="0"/>
-            </w:pPr>
-            <w:r>
-              <w:rPr>
-                <w:rFonts w:ascii="Times New Roman" w:hAnsi="Times New Roman"/>
+            <w:tcW w:w="1556" w:type="dxa"/>
+          </w:tcPr>
+          <w:p>
+            <w:pPr>
+              <w:pStyle w:val="Compact"/>
+              <w:keepNext/>
+              <w:spacing w:before="0" w:after="0"/>
+            </w:pPr>
+            <w:r>
+              <w:rPr>
                 <w:sz w:val="24"/>
               </w:rPr>
               <w:t>Размер рынка</w:t>
@@ -625,17 +583,16 @@
         </w:tc>
         <w:tc>
           <w:tcPr>
-            <w:tcW w:w="5564" w:type="dxa"/>
-          </w:tcPr>
-          <w:p>
-            <w:pPr>
-              <w:pStyle w:val="Compact"/>
-              <w:spacing w:line="240" w:lineRule="auto"/>
-              <w:ind w:firstLine="0"/>
-            </w:pPr>
-            <w:r>
-              <w:rPr>
-                <w:rFonts w:ascii="Times New Roman" w:hAnsi="Times New Roman"/>
+            <w:tcW w:w="5871" w:type="dxa"/>
+          </w:tcPr>
+          <w:p>
+            <w:pPr>
+              <w:pStyle w:val="Compact"/>
+              <w:keepNext/>
+              <w:spacing w:before="0" w:after="0"/>
+            </w:pPr>
+            <w:r>
+              <w:rPr>
                 <w:sz w:val="24"/>
               </w:rPr>
               <w:t>SAM 49 893–414 754 BYN в год; SOM 249–16 590 BYN; базовая оценка – около 33 платящих пользователей Pro</w:t>
@@ -644,17 +601,16 @@
         </w:tc>
         <w:tc>
           <w:tcPr>
-            <w:tcW w:w="1973" w:type="dxa"/>
-          </w:tcPr>
-          <w:p>
-            <w:pPr>
-              <w:pStyle w:val="Compact"/>
-              <w:spacing w:line="240" w:lineRule="auto"/>
-              <w:ind w:firstLine="0"/>
-            </w:pPr>
-            <w:r>
-              <w:rPr>
-                <w:rFonts w:ascii="Times New Roman" w:hAnsi="Times New Roman"/>
+            <w:tcW w:w="1927" w:type="dxa"/>
+          </w:tcPr>
+          <w:p>
+            <w:pPr>
+              <w:pStyle w:val="Compact"/>
+              <w:keepNext/>
+              <w:spacing w:before="0" w:after="0"/>
+            </w:pPr>
+            <w:r>
+              <w:rPr>
                 <w:sz w:val="24"/>
               </w:rPr>
               <w:t>ЛР2-3</w:t>
@@ -668,17 +624,15 @@
         </w:trPr>
         <w:tc>
           <w:tcPr>
-            <w:tcW w:w="2152" w:type="dxa"/>
-          </w:tcPr>
-          <w:p>
-            <w:pPr>
-              <w:pStyle w:val="Compact"/>
-              <w:spacing w:line="240" w:lineRule="auto"/>
-              <w:ind w:firstLine="0"/>
-            </w:pPr>
-            <w:r>
-              <w:rPr>
-                <w:rFonts w:ascii="Times New Roman" w:hAnsi="Times New Roman"/>
+            <w:tcW w:w="1556" w:type="dxa"/>
+          </w:tcPr>
+          <w:p>
+            <w:pPr>
+              <w:pStyle w:val="Compact"/>
+              <w:spacing w:before="0" w:after="0"/>
+            </w:pPr>
+            <w:r>
+              <w:rPr>
                 <w:sz w:val="24"/>
               </w:rPr>
               <w:t>Барьеры входа и выхода</w:t>
@@ -687,17 +641,15 @@
         </w:tc>
         <w:tc>
           <w:tcPr>
-            <w:tcW w:w="5564" w:type="dxa"/>
-          </w:tcPr>
-          <w:p>
-            <w:pPr>
-              <w:pStyle w:val="Compact"/>
-              <w:spacing w:line="240" w:lineRule="auto"/>
-              <w:ind w:firstLine="0"/>
-            </w:pPr>
-            <w:r>
-              <w:rPr>
-                <w:rFonts w:ascii="Times New Roman" w:hAnsi="Times New Roman"/>
+            <w:tcW w:w="5871" w:type="dxa"/>
+          </w:tcPr>
+          <w:p>
+            <w:pPr>
+              <w:pStyle w:val="Compact"/>
+              <w:spacing w:before="0" w:after="0"/>
+            </w:pPr>
+            <w:r>
+              <w:rPr>
                 <w:sz w:val="24"/>
               </w:rPr>
               <w:t>Вход: технологический и доверительный – высокие; выход – низкие барьеры (веб-сервис без крупных обязательств)</w:t>
@@ -706,17 +658,15 @@
         </w:tc>
         <w:tc>
           <w:tcPr>
-            <w:tcW w:w="1973" w:type="dxa"/>
-          </w:tcPr>
-          <w:p>
-            <w:pPr>
-              <w:pStyle w:val="Compact"/>
-              <w:spacing w:line="240" w:lineRule="auto"/>
-              <w:ind w:firstLine="0"/>
-            </w:pPr>
-            <w:r>
-              <w:rPr>
-                <w:rFonts w:ascii="Times New Roman" w:hAnsi="Times New Roman"/>
+            <w:tcW w:w="1927" w:type="dxa"/>
+          </w:tcPr>
+          <w:p>
+            <w:pPr>
+              <w:pStyle w:val="Compact"/>
+              <w:spacing w:before="0" w:after="0"/>
+            </w:pPr>
+            <w:r>
+              <w:rPr>
                 <w:sz w:val="24"/>
               </w:rPr>
               <w:t>ЛР4, ЛР6</w:t>
@@ -728,25 +678,19 @@
     <w:p>
       <w:pPr>
         <w:pStyle w:val="FirstParagraph"/>
-        <w:spacing w:lineRule="exact" w:line="360" w:before="360" w:after="0"/>
+        <w:spacing w:before="360" w:after="0" w:line="360" w:lineRule="exact"/>
         <w:ind w:firstLine="709"/>
         <w:jc w:val="both"/>
       </w:pPr>
       <w:r>
-        <w:rPr>
-          <w:rFonts w:ascii="Times New Roman" w:hAnsi="Times New Roman"/>
-          <w:sz w:val="28"/>
-        </w:rPr>
         <w:t>Итог этапа. Основание для ограниченного старта есть: подтверждены конкурентный пробел и возможность проверить ЦП в первом релизе; спрос и размер рынка достаточны лишь для проверки модели.</w:t>
       </w:r>
     </w:p>
     <w:p>
       <w:pPr>
         <w:pStyle w:val="2"/>
-        <w:keepNext/>
-        <w:spacing w:lineRule="exact" w:line="360" w:before="360" w:after="360"/>
+        <w:spacing w:before="360" w:after="360" w:line="360" w:lineRule="exact"/>
         <w:ind w:firstLine="709"/>
-        <w:jc w:val="left"/>
       </w:pPr>
       <w:bookmarkStart w:id="3" w:name="_234235faf43bf5faecb743b4d41da460e0bb675"/>
       <w:bookmarkEnd w:id="2"/>
@@ -762,33 +706,23 @@
     <w:p>
       <w:pPr>
         <w:pStyle w:val="FirstParagraph"/>
-        <w:spacing w:lineRule="exact" w:line="360" w:before="0" w:after="0"/>
+        <w:spacing w:before="0" w:after="0" w:line="360" w:lineRule="exact"/>
         <w:ind w:firstLine="709"/>
         <w:jc w:val="both"/>
       </w:pPr>
       <w:r>
-        <w:rPr>
-          <w:rFonts w:ascii="Times New Roman" w:hAnsi="Times New Roman"/>
-          <w:sz w:val="28"/>
-        </w:rPr>
-        <w:t xml:space="preserve">Уровень конкуренции: 1 прямой (PlantUML), 4 близких, 9 косвенных и заменителей, главный заменитель – бесплатный draw.io. Рыночный стандарт: бесплатный доступ, экспорт, интеграции, документация, открытая цена. Преимущество проекта: полный набор нотаций, </w:t>
+        <w:t xml:space="preserve">Уровень конкуренции: 1 прямой (PlantUML), 4 близких, 9 косвенных и заменителей, главный заменитель – бесплатный draw.io. Рыночный стандарт: </w:t>
       </w:r>
       <w:r>
-        <w:rPr>
-          <w:rFonts w:ascii="Times New Roman" w:hAnsi="Times New Roman"/>
-          <w:sz w:val="28"/>
-        </w:rPr>
         <w:lastRenderedPageBreak/>
-        <w:t>включая IDEF0, DFD и сети Петри. Главная проблема клиента: клиент не может построить диаграмму всех нотаций проекта без нескольких инструментов и освоения синтаксиса.</w:t>
+        <w:t>бесплатный доступ, экспорт, интеграции, документация, открытая цена. Преимущество проекта: полный набор нотаций, включая IDEF0, DFD и сети Петри. Главная проблема клиента: клиент не может построить диаграмму всех нотаций проекта без нескольких инструментов и освоения синтаксиса.</w:t>
       </w:r>
     </w:p>
     <w:p>
       <w:pPr>
         <w:pStyle w:val="2"/>
-        <w:keepNext/>
-        <w:spacing w:lineRule="exact" w:line="360" w:before="360" w:after="360"/>
+        <w:spacing w:before="360" w:after="360" w:line="360" w:lineRule="exact"/>
         <w:ind w:firstLine="709"/>
-        <w:jc w:val="left"/>
       </w:pPr>
       <w:bookmarkStart w:id="4" w:name="_3b347109e9f870c8163e96f482bfb7f75c0dad9"/>
       <w:bookmarkEnd w:id="3"/>
@@ -804,34 +738,32 @@
     <w:tbl>
       <w:tblPr>
         <w:tblStyle w:val="Table"/>
-        <w:tblW w:w="9689" w:type="dxa"/>
+        <w:tblW w:w="9355" w:type="dxa"/>
         <w:tblLayout w:type="fixed"/>
         <w:tblLook w:val="0020" w:firstRow="1" w:lastRow="0" w:firstColumn="0" w:lastColumn="0" w:noHBand="0" w:noVBand="0"/>
       </w:tblPr>
       <w:tblGrid>
-        <w:gridCol w:w="3237"/>
-        <w:gridCol w:w="6452"/>
+        <w:gridCol w:w="1783"/>
+        <w:gridCol w:w="7572"/>
       </w:tblGrid>
       <w:tr>
         <w:trPr>
           <w:cnfStyle w:val="100000000000" w:firstRow="1" w:lastRow="0" w:firstColumn="0" w:lastColumn="0" w:oddVBand="0" w:evenVBand="0" w:oddHBand="0" w:evenHBand="0" w:firstRowFirstColumn="0" w:firstRowLastColumn="0" w:lastRowFirstColumn="0" w:lastRowLastColumn="0"/>
+          <w:cantSplit/>
           <w:tblHeader/>
-          <w:cantSplit/>
         </w:trPr>
         <w:tc>
           <w:tcPr>
-            <w:tcW w:w="3237" w:type="dxa"/>
-          </w:tcPr>
-          <w:p>
-            <w:pPr>
-              <w:pStyle w:val="Compact"/>
-              <w:keepNext/>
-              <w:spacing w:line="240" w:lineRule="auto"/>
-              <w:ind w:firstLine="0"/>
-            </w:pPr>
-            <w:r>
-              <w:rPr>
-                <w:rFonts w:ascii="Times New Roman" w:hAnsi="Times New Roman"/>
+            <w:tcW w:w="1783" w:type="dxa"/>
+          </w:tcPr>
+          <w:p>
+            <w:pPr>
+              <w:pStyle w:val="Compact"/>
+              <w:keepNext/>
+              <w:spacing w:before="0" w:after="0"/>
+            </w:pPr>
+            <w:r>
+              <w:rPr>
                 <w:sz w:val="24"/>
               </w:rPr>
               <w:t>Элемент</w:t>
@@ -840,18 +772,16 @@
         </w:tc>
         <w:tc>
           <w:tcPr>
-            <w:tcW w:w="6452" w:type="dxa"/>
-          </w:tcPr>
-          <w:p>
-            <w:pPr>
-              <w:pStyle w:val="Compact"/>
-              <w:keepNext/>
-              <w:spacing w:line="240" w:lineRule="auto"/>
-              <w:ind w:firstLine="0"/>
-            </w:pPr>
-            <w:r>
-              <w:rPr>
-                <w:rFonts w:ascii="Times New Roman" w:hAnsi="Times New Roman"/>
+            <w:tcW w:w="7571" w:type="dxa"/>
+          </w:tcPr>
+          <w:p>
+            <w:pPr>
+              <w:pStyle w:val="Compact"/>
+              <w:keepNext/>
+              <w:spacing w:before="0" w:after="0"/>
+            </w:pPr>
+            <w:r>
+              <w:rPr>
                 <w:sz w:val="24"/>
               </w:rPr>
               <w:t>Запись</w:t>
@@ -865,18 +795,16 @@
         </w:trPr>
         <w:tc>
           <w:tcPr>
-            <w:tcW w:w="3237" w:type="dxa"/>
-          </w:tcPr>
-          <w:p>
-            <w:pPr>
-              <w:pStyle w:val="Compact"/>
-              <w:keepNext/>
-              <w:spacing w:line="240" w:lineRule="auto"/>
-              <w:ind w:firstLine="0"/>
-            </w:pPr>
-            <w:r>
-              <w:rPr>
-                <w:rFonts w:ascii="Times New Roman" w:hAnsi="Times New Roman"/>
+            <w:tcW w:w="1783" w:type="dxa"/>
+          </w:tcPr>
+          <w:p>
+            <w:pPr>
+              <w:pStyle w:val="Compact"/>
+              <w:keepNext/>
+              <w:spacing w:before="0" w:after="0"/>
+            </w:pPr>
+            <w:r>
+              <w:rPr>
                 <w:sz w:val="24"/>
               </w:rPr>
               <w:t>Целевой сегмент</w:t>
@@ -885,18 +813,16 @@
         </w:tc>
         <w:tc>
           <w:tcPr>
-            <w:tcW w:w="6452" w:type="dxa"/>
-          </w:tcPr>
-          <w:p>
-            <w:pPr>
-              <w:pStyle w:val="Compact"/>
-              <w:keepNext/>
-              <w:spacing w:line="240" w:lineRule="auto"/>
-              <w:ind w:firstLine="0"/>
-            </w:pPr>
-            <w:r>
-              <w:rPr>
-                <w:rFonts w:ascii="Times New Roman" w:hAnsi="Times New Roman"/>
+            <w:tcW w:w="7571" w:type="dxa"/>
+          </w:tcPr>
+          <w:p>
+            <w:pPr>
+              <w:pStyle w:val="Compact"/>
+              <w:keepNext/>
+              <w:spacing w:before="0" w:after="0"/>
+            </w:pPr>
+            <w:r>
+              <w:rPr>
                 <w:sz w:val="24"/>
               </w:rPr>
               <w:t>Студенты технических специальностей (Free), аналитики и разработчики ПО (Pro)</w:t>
@@ -910,17 +836,16 @@
         </w:trPr>
         <w:tc>
           <w:tcPr>
-            <w:tcW w:w="3237" w:type="dxa"/>
-          </w:tcPr>
-          <w:p>
-            <w:pPr>
-              <w:pStyle w:val="Compact"/>
-              <w:spacing w:line="240" w:lineRule="auto"/>
-              <w:ind w:firstLine="0"/>
-            </w:pPr>
-            <w:r>
-              <w:rPr>
-                <w:rFonts w:ascii="Times New Roman" w:hAnsi="Times New Roman"/>
+            <w:tcW w:w="1783" w:type="dxa"/>
+          </w:tcPr>
+          <w:p>
+            <w:pPr>
+              <w:pStyle w:val="Compact"/>
+              <w:keepNext/>
+              <w:spacing w:before="0" w:after="0"/>
+            </w:pPr>
+            <w:r>
+              <w:rPr>
                 <w:sz w:val="24"/>
               </w:rPr>
               <w:t>Опорная проблема</w:t>
@@ -929,17 +854,16 @@
         </w:tc>
         <w:tc>
           <w:tcPr>
-            <w:tcW w:w="6452" w:type="dxa"/>
-          </w:tcPr>
-          <w:p>
-            <w:pPr>
-              <w:pStyle w:val="Compact"/>
-              <w:spacing w:line="240" w:lineRule="auto"/>
-              <w:ind w:firstLine="0"/>
-            </w:pPr>
-            <w:r>
-              <w:rPr>
-                <w:rFonts w:ascii="Times New Roman" w:hAnsi="Times New Roman"/>
+            <w:tcW w:w="7571" w:type="dxa"/>
+          </w:tcPr>
+          <w:p>
+            <w:pPr>
+              <w:pStyle w:val="Compact"/>
+              <w:keepNext/>
+              <w:spacing w:before="0" w:after="0"/>
+            </w:pPr>
+            <w:r>
+              <w:rPr>
                 <w:sz w:val="24"/>
               </w:rPr>
               <w:t>Нет единого инструмента для всех нотаций (индекс 74)</w:t>
@@ -953,17 +877,16 @@
         </w:trPr>
         <w:tc>
           <w:tcPr>
-            <w:tcW w:w="3237" w:type="dxa"/>
-          </w:tcPr>
-          <w:p>
-            <w:pPr>
-              <w:pStyle w:val="Compact"/>
-              <w:spacing w:line="240" w:lineRule="auto"/>
-              <w:ind w:firstLine="0"/>
-            </w:pPr>
-            <w:r>
-              <w:rPr>
-                <w:rFonts w:ascii="Times New Roman" w:hAnsi="Times New Roman"/>
+            <w:tcW w:w="1783" w:type="dxa"/>
+          </w:tcPr>
+          <w:p>
+            <w:pPr>
+              <w:pStyle w:val="Compact"/>
+              <w:keepNext/>
+              <w:spacing w:before="0" w:after="0"/>
+            </w:pPr>
+            <w:r>
+              <w:rPr>
                 <w:sz w:val="24"/>
               </w:rPr>
               <w:t>ЦП</w:t>
@@ -972,17 +895,16 @@
         </w:tc>
         <w:tc>
           <w:tcPr>
-            <w:tcW w:w="6452" w:type="dxa"/>
-          </w:tcPr>
-          <w:p>
-            <w:pPr>
-              <w:pStyle w:val="Compact"/>
-              <w:spacing w:line="240" w:lineRule="auto"/>
-              <w:ind w:firstLine="0"/>
-            </w:pPr>
-            <w:r>
-              <w:rPr>
-                <w:rFonts w:ascii="Times New Roman" w:hAnsi="Times New Roman"/>
+            <w:tcW w:w="7571" w:type="dxa"/>
+          </w:tcPr>
+          <w:p>
+            <w:pPr>
+              <w:pStyle w:val="Compact"/>
+              <w:keepNext/>
+              <w:spacing w:before="0" w:after="0"/>
+            </w:pPr>
+            <w:r>
+              <w:rPr>
                 <w:sz w:val="24"/>
               </w:rPr>
               <w:t>Для студентов и аналитиков ПО, которые сталкиваются с несколькими инструментами для нотаций, проект предлагает единый редактор, позволяющий получить диаграмму любой нотации из текста лучше, чем draw.io и PlantUML, за счет набора нотаций, включая IDEF0 и DFD</w:t>
@@ -996,17 +918,16 @@
         </w:trPr>
         <w:tc>
           <w:tcPr>
-            <w:tcW w:w="3237" w:type="dxa"/>
-          </w:tcPr>
-          <w:p>
-            <w:pPr>
-              <w:pStyle w:val="Compact"/>
-              <w:spacing w:line="240" w:lineRule="auto"/>
-              <w:ind w:firstLine="0"/>
-            </w:pPr>
-            <w:r>
-              <w:rPr>
-                <w:rFonts w:ascii="Times New Roman" w:hAnsi="Times New Roman"/>
+            <w:tcW w:w="1783" w:type="dxa"/>
+          </w:tcPr>
+          <w:p>
+            <w:pPr>
+              <w:pStyle w:val="Compact"/>
+              <w:keepNext/>
+              <w:spacing w:before="0" w:after="0"/>
+            </w:pPr>
+            <w:r>
+              <w:rPr>
                 <w:sz w:val="24"/>
               </w:rPr>
               <w:t>Цифровой товар</w:t>
@@ -1015,17 +936,16 @@
         </w:tc>
         <w:tc>
           <w:tcPr>
-            <w:tcW w:w="6452" w:type="dxa"/>
-          </w:tcPr>
-          <w:p>
-            <w:pPr>
-              <w:pStyle w:val="Compact"/>
-              <w:spacing w:line="240" w:lineRule="auto"/>
-              <w:ind w:firstLine="0"/>
-            </w:pPr>
-            <w:r>
-              <w:rPr>
-                <w:rFonts w:ascii="Times New Roman" w:hAnsi="Times New Roman"/>
+            <w:tcW w:w="7571" w:type="dxa"/>
+          </w:tcPr>
+          <w:p>
+            <w:pPr>
+              <w:pStyle w:val="Compact"/>
+              <w:keepNext/>
+              <w:spacing w:before="0" w:after="0"/>
+            </w:pPr>
+            <w:r>
+              <w:rPr>
                 <w:sz w:val="24"/>
               </w:rPr>
               <w:t>Веб-платформа (PWA): редактор, предпросмотр, экспорт, ИИ-ассистент</w:t>
@@ -1039,17 +959,16 @@
         </w:trPr>
         <w:tc>
           <w:tcPr>
-            <w:tcW w:w="3237" w:type="dxa"/>
-          </w:tcPr>
-          <w:p>
-            <w:pPr>
-              <w:pStyle w:val="Compact"/>
-              <w:spacing w:line="240" w:lineRule="auto"/>
-              <w:ind w:firstLine="0"/>
-            </w:pPr>
-            <w:r>
-              <w:rPr>
-                <w:rFonts w:ascii="Times New Roman" w:hAnsi="Times New Roman"/>
+            <w:tcW w:w="1783" w:type="dxa"/>
+          </w:tcPr>
+          <w:p>
+            <w:pPr>
+              <w:pStyle w:val="Compact"/>
+              <w:keepNext/>
+              <w:spacing w:before="0" w:after="0"/>
+            </w:pPr>
+            <w:r>
+              <w:rPr>
                 <w:sz w:val="24"/>
               </w:rPr>
               <w:t>Единица монетизации</w:t>
@@ -1058,17 +977,16 @@
         </w:tc>
         <w:tc>
           <w:tcPr>
-            <w:tcW w:w="6452" w:type="dxa"/>
-          </w:tcPr>
-          <w:p>
-            <w:pPr>
-              <w:pStyle w:val="Compact"/>
-              <w:spacing w:line="240" w:lineRule="auto"/>
-              <w:ind w:firstLine="0"/>
-            </w:pPr>
-            <w:r>
-              <w:rPr>
-                <w:rFonts w:ascii="Times New Roman" w:hAnsi="Times New Roman"/>
+            <w:tcW w:w="7571" w:type="dxa"/>
+          </w:tcPr>
+          <w:p>
+            <w:pPr>
+              <w:pStyle w:val="Compact"/>
+              <w:keepNext/>
+              <w:spacing w:before="0" w:after="0"/>
+            </w:pPr>
+            <w:r>
+              <w:rPr>
                 <w:sz w:val="24"/>
               </w:rPr>
               <w:t>Пользователь Pro, подписка 40 USD в год (48 USD при 4 × 12)</w:t>
@@ -1082,17 +1000,15 @@
         </w:trPr>
         <w:tc>
           <w:tcPr>
-            <w:tcW w:w="3237" w:type="dxa"/>
-          </w:tcPr>
-          <w:p>
-            <w:pPr>
-              <w:pStyle w:val="Compact"/>
-              <w:spacing w:line="240" w:lineRule="auto"/>
-              <w:ind w:firstLine="0"/>
-            </w:pPr>
-            <w:r>
-              <w:rPr>
-                <w:rFonts w:ascii="Times New Roman" w:hAnsi="Times New Roman"/>
+            <w:tcW w:w="1783" w:type="dxa"/>
+          </w:tcPr>
+          <w:p>
+            <w:pPr>
+              <w:pStyle w:val="Compact"/>
+              <w:spacing w:before="0" w:after="0"/>
+            </w:pPr>
+            <w:r>
+              <w:rPr>
                 <w:sz w:val="24"/>
               </w:rPr>
               <w:t>Потенциал удержания</w:t>
@@ -1101,17 +1017,15 @@
         </w:tc>
         <w:tc>
           <w:tcPr>
-            <w:tcW w:w="6452" w:type="dxa"/>
-          </w:tcPr>
-          <w:p>
-            <w:pPr>
-              <w:pStyle w:val="Compact"/>
-              <w:spacing w:line="240" w:lineRule="auto"/>
-              <w:ind w:firstLine="0"/>
-            </w:pPr>
-            <w:r>
-              <w:rPr>
-                <w:rFonts w:ascii="Times New Roman" w:hAnsi="Times New Roman"/>
+            <w:tcW w:w="7571" w:type="dxa"/>
+          </w:tcPr>
+          <w:p>
+            <w:pPr>
+              <w:pStyle w:val="Compact"/>
+              <w:spacing w:before="0" w:after="0"/>
+            </w:pPr>
+            <w:r>
+              <w:rPr>
                 <w:sz w:val="24"/>
               </w:rPr>
               <w:t>Низкий: задача сезонная; нужны история и повторное использование (релиз 2)</w:t>
@@ -1123,10 +1037,8 @@
     <w:p>
       <w:pPr>
         <w:pStyle w:val="2"/>
-        <w:keepNext/>
-        <w:spacing w:lineRule="exact" w:line="360" w:before="360" w:after="360"/>
+        <w:spacing w:before="360" w:after="360" w:line="360" w:lineRule="exact"/>
         <w:ind w:firstLine="709"/>
-        <w:jc w:val="left"/>
       </w:pPr>
       <w:bookmarkStart w:id="5" w:name="_14a433871fbfe9307ad4f8e76b552f055908b34"/>
       <w:bookmarkEnd w:id="4"/>
@@ -1142,25 +1054,19 @@
     <w:p>
       <w:pPr>
         <w:pStyle w:val="FirstParagraph"/>
-        <w:spacing w:lineRule="exact" w:line="360" w:before="0" w:after="0"/>
+        <w:spacing w:before="0" w:after="0" w:line="360" w:lineRule="exact"/>
         <w:ind w:firstLine="709"/>
         <w:jc w:val="both"/>
       </w:pPr>
       <w:r>
-        <w:rPr>
-          <w:rFonts w:ascii="Times New Roman" w:hAnsi="Times New Roman"/>
-          <w:sz w:val="28"/>
-        </w:rPr>
         <w:t>Сегменты: студенты (Free), аналитики и разработчики (Pro). Ценность: диаграмма любой нотации из текста в одном инструменте. Каналы: поиск, сайт, вузы. Отношения: самообслуживание, документация. Доходы = подписка Pro × пользователь × год. Ресурсы и процессы: движок нотаций, разработка, документация. Партнеры и затраты: вузы, платежный и ИИ-провайдеры; разработка, облако, ИИ-вызовы. Итог этапа: ЦП, товар, монетизация, канал и первый релиз описывают одну задачу – построение диаграмм нотаций проекта; полнота Канваса 71 %.</w:t>
       </w:r>
     </w:p>
     <w:p>
       <w:pPr>
         <w:pStyle w:val="2"/>
-        <w:keepNext/>
-        <w:spacing w:lineRule="exact" w:line="360" w:before="360" w:after="360"/>
+        <w:spacing w:before="360" w:after="360" w:line="360" w:lineRule="exact"/>
         <w:ind w:firstLine="709"/>
-        <w:jc w:val="left"/>
       </w:pPr>
       <w:bookmarkStart w:id="6" w:name="_9045b3781ba6932f318296069f0ff05d9436ea2"/>
       <w:bookmarkEnd w:id="5"/>
@@ -1170,41 +1076,40 @@
           <w:b/>
           <w:sz w:val="28"/>
         </w:rPr>
+        <w:lastRenderedPageBreak/>
         <w:t>6 Первый релиз, последующие релизы и ТЗ</w:t>
       </w:r>
     </w:p>
     <w:tbl>
       <w:tblPr>
         <w:tblStyle w:val="Table"/>
-        <w:tblW w:w="9689" w:type="dxa"/>
+        <w:tblW w:w="9355" w:type="dxa"/>
         <w:tblLayout w:type="fixed"/>
         <w:tblLook w:val="0020" w:firstRow="1" w:lastRow="0" w:firstColumn="0" w:lastColumn="0" w:noHBand="0" w:noVBand="0"/>
       </w:tblPr>
       <w:tblGrid>
-        <w:gridCol w:w="1802"/>
-        <w:gridCol w:w="4907"/>
-        <w:gridCol w:w="2981"/>
+        <w:gridCol w:w="1620"/>
+        <w:gridCol w:w="4645"/>
+        <w:gridCol w:w="3090"/>
       </w:tblGrid>
       <w:tr>
         <w:trPr>
           <w:cnfStyle w:val="100000000000" w:firstRow="1" w:lastRow="0" w:firstColumn="0" w:lastColumn="0" w:oddVBand="0" w:evenVBand="0" w:oddHBand="0" w:evenHBand="0" w:firstRowFirstColumn="0" w:firstRowLastColumn="0" w:lastRowFirstColumn="0" w:lastRowLastColumn="0"/>
+          <w:cantSplit/>
           <w:tblHeader/>
-          <w:cantSplit/>
         </w:trPr>
         <w:tc>
           <w:tcPr>
-            <w:tcW w:w="1802" w:type="dxa"/>
-          </w:tcPr>
-          <w:p>
-            <w:pPr>
-              <w:pStyle w:val="Compact"/>
-              <w:keepNext/>
-              <w:spacing w:line="240" w:lineRule="auto"/>
-              <w:ind w:firstLine="0"/>
-            </w:pPr>
-            <w:r>
-              <w:rPr>
-                <w:rFonts w:ascii="Times New Roman" w:hAnsi="Times New Roman"/>
+            <w:tcW w:w="1619" w:type="dxa"/>
+          </w:tcPr>
+          <w:p>
+            <w:pPr>
+              <w:pStyle w:val="Compact"/>
+              <w:keepNext/>
+              <w:spacing w:before="0" w:after="0"/>
+            </w:pPr>
+            <w:r>
+              <w:rPr>
                 <w:sz w:val="24"/>
               </w:rPr>
               <w:t>Раздел</w:t>
@@ -1213,18 +1118,16 @@
         </w:tc>
         <w:tc>
           <w:tcPr>
-            <w:tcW w:w="4907" w:type="dxa"/>
-          </w:tcPr>
-          <w:p>
-            <w:pPr>
-              <w:pStyle w:val="Compact"/>
-              <w:keepNext/>
-              <w:spacing w:line="240" w:lineRule="auto"/>
-              <w:ind w:firstLine="0"/>
-            </w:pPr>
-            <w:r>
-              <w:rPr>
-                <w:rFonts w:ascii="Times New Roman" w:hAnsi="Times New Roman"/>
+            <w:tcW w:w="4645" w:type="dxa"/>
+          </w:tcPr>
+          <w:p>
+            <w:pPr>
+              <w:pStyle w:val="Compact"/>
+              <w:keepNext/>
+              <w:spacing w:before="0" w:after="0"/>
+            </w:pPr>
+            <w:r>
+              <w:rPr>
                 <w:sz w:val="24"/>
               </w:rPr>
               <w:t>Первый релиз</w:t>
@@ -1233,18 +1136,16 @@
         </w:tc>
         <w:tc>
           <w:tcPr>
-            <w:tcW w:w="2981" w:type="dxa"/>
-          </w:tcPr>
-          <w:p>
-            <w:pPr>
-              <w:pStyle w:val="Compact"/>
-              <w:keepNext/>
-              <w:spacing w:line="240" w:lineRule="auto"/>
-              <w:ind w:firstLine="0"/>
-            </w:pPr>
-            <w:r>
-              <w:rPr>
-                <w:rFonts w:ascii="Times New Roman" w:hAnsi="Times New Roman"/>
+            <w:tcW w:w="3090" w:type="dxa"/>
+          </w:tcPr>
+          <w:p>
+            <w:pPr>
+              <w:pStyle w:val="Compact"/>
+              <w:keepNext/>
+              <w:spacing w:before="0" w:after="0"/>
+            </w:pPr>
+            <w:r>
+              <w:rPr>
                 <w:sz w:val="24"/>
               </w:rPr>
               <w:t>Следующие релизы</w:t>
@@ -1258,18 +1159,16 @@
         </w:trPr>
         <w:tc>
           <w:tcPr>
-            <w:tcW w:w="1802" w:type="dxa"/>
-          </w:tcPr>
-          <w:p>
-            <w:pPr>
-              <w:pStyle w:val="Compact"/>
-              <w:keepNext/>
-              <w:spacing w:line="240" w:lineRule="auto"/>
-              <w:ind w:firstLine="0"/>
-            </w:pPr>
-            <w:r>
-              <w:rPr>
-                <w:rFonts w:ascii="Times New Roman" w:hAnsi="Times New Roman"/>
+            <w:tcW w:w="1619" w:type="dxa"/>
+          </w:tcPr>
+          <w:p>
+            <w:pPr>
+              <w:pStyle w:val="Compact"/>
+              <w:keepNext/>
+              <w:spacing w:before="0" w:after="0"/>
+            </w:pPr>
+            <w:r>
+              <w:rPr>
                 <w:sz w:val="24"/>
               </w:rPr>
               <w:t>Функции</w:t>
@@ -1278,18 +1177,16 @@
         </w:tc>
         <w:tc>
           <w:tcPr>
-            <w:tcW w:w="4907" w:type="dxa"/>
-          </w:tcPr>
-          <w:p>
-            <w:pPr>
-              <w:pStyle w:val="Compact"/>
-              <w:keepNext/>
-              <w:spacing w:line="240" w:lineRule="auto"/>
-              <w:ind w:firstLine="0"/>
-            </w:pPr>
-            <w:r>
-              <w:rPr>
-                <w:rFonts w:ascii="Times New Roman" w:hAnsi="Times New Roman"/>
+            <w:tcW w:w="4645" w:type="dxa"/>
+          </w:tcPr>
+          <w:p>
+            <w:pPr>
+              <w:pStyle w:val="Compact"/>
+              <w:keepNext/>
+              <w:spacing w:before="0" w:after="0"/>
+            </w:pPr>
+            <w:r>
+              <w:rPr>
                 <w:sz w:val="24"/>
               </w:rPr>
               <w:t>Текстовый ввод с предпросмотром, нотации волны 1 (UML, ERD, IDEF0, IDEF1X, IDEF3, DFD), экспорт SVG и PNG, регистрация, тарифы, оплата или заявка Pro, заглушка ИИ-ассистента</w:t>
@@ -1298,18 +1195,16 @@
         </w:tc>
         <w:tc>
           <w:tcPr>
-            <w:tcW w:w="2981" w:type="dxa"/>
-          </w:tcPr>
-          <w:p>
-            <w:pPr>
-              <w:pStyle w:val="Compact"/>
-              <w:keepNext/>
-              <w:spacing w:line="240" w:lineRule="auto"/>
-              <w:ind w:firstLine="0"/>
-            </w:pPr>
-            <w:r>
-              <w:rPr>
-                <w:rFonts w:ascii="Times New Roman" w:hAnsi="Times New Roman"/>
+            <w:tcW w:w="3090" w:type="dxa"/>
+          </w:tcPr>
+          <w:p>
+            <w:pPr>
+              <w:pStyle w:val="Compact"/>
+              <w:keepNext/>
+              <w:spacing w:before="0" w:after="0"/>
+            </w:pPr>
+            <w:r>
+              <w:rPr>
                 <w:sz w:val="24"/>
               </w:rPr>
               <w:t>BPMN 2.0, сети Петри, ИИ-ассистент с квотами, подсказки об ошибках, совместная работа, API</w:t>
@@ -1323,17 +1218,16 @@
         </w:trPr>
         <w:tc>
           <w:tcPr>
-            <w:tcW w:w="1802" w:type="dxa"/>
-          </w:tcPr>
-          <w:p>
-            <w:pPr>
-              <w:pStyle w:val="Compact"/>
-              <w:spacing w:line="240" w:lineRule="auto"/>
-              <w:ind w:firstLine="0"/>
-            </w:pPr>
-            <w:r>
-              <w:rPr>
-                <w:rFonts w:ascii="Times New Roman" w:hAnsi="Times New Roman"/>
+            <w:tcW w:w="1619" w:type="dxa"/>
+          </w:tcPr>
+          <w:p>
+            <w:pPr>
+              <w:pStyle w:val="Compact"/>
+              <w:keepNext/>
+              <w:spacing w:before="0" w:after="0"/>
+            </w:pPr>
+            <w:r>
+              <w:rPr>
                 <w:sz w:val="24"/>
               </w:rPr>
               <w:t>Страницы / экраны</w:t>
@@ -1342,17 +1236,16 @@
         </w:tc>
         <w:tc>
           <w:tcPr>
-            <w:tcW w:w="4907" w:type="dxa"/>
-          </w:tcPr>
-          <w:p>
-            <w:pPr>
-              <w:pStyle w:val="Compact"/>
-              <w:spacing w:line="240" w:lineRule="auto"/>
-              <w:ind w:firstLine="0"/>
-            </w:pPr>
-            <w:r>
-              <w:rPr>
-                <w:rFonts w:ascii="Times New Roman" w:hAnsi="Times New Roman"/>
+            <w:tcW w:w="4645" w:type="dxa"/>
+          </w:tcPr>
+          <w:p>
+            <w:pPr>
+              <w:pStyle w:val="Compact"/>
+              <w:keepNext/>
+              <w:spacing w:before="0" w:after="0"/>
+            </w:pPr>
+            <w:r>
+              <w:rPr>
                 <w:sz w:val="24"/>
               </w:rPr>
               <w:t>Главная, возможности, тарифы, регистрация, оплата, выбор нотации, редактор, экспорт, правовые тексты</w:t>
@@ -1361,17 +1254,16 @@
         </w:tc>
         <w:tc>
           <w:tcPr>
-            <w:tcW w:w="2981" w:type="dxa"/>
-          </w:tcPr>
-          <w:p>
-            <w:pPr>
-              <w:pStyle w:val="Compact"/>
-              <w:spacing w:line="240" w:lineRule="auto"/>
-              <w:ind w:firstLine="0"/>
-            </w:pPr>
-            <w:r>
-              <w:rPr>
-                <w:rFonts w:ascii="Times New Roman" w:hAnsi="Times New Roman"/>
+            <w:tcW w:w="3090" w:type="dxa"/>
+          </w:tcPr>
+          <w:p>
+            <w:pPr>
+              <w:pStyle w:val="Compact"/>
+              <w:keepNext/>
+              <w:spacing w:before="0" w:after="0"/>
+            </w:pPr>
+            <w:r>
+              <w:rPr>
                 <w:sz w:val="24"/>
               </w:rPr>
               <w:t>Мои диаграммы, профиль и подписка, документация, ИИ-ассистент</w:t>
@@ -1385,17 +1277,16 @@
         </w:trPr>
         <w:tc>
           <w:tcPr>
-            <w:tcW w:w="1802" w:type="dxa"/>
-          </w:tcPr>
-          <w:p>
-            <w:pPr>
-              <w:pStyle w:val="Compact"/>
-              <w:spacing w:line="240" w:lineRule="auto"/>
-              <w:ind w:firstLine="0"/>
-            </w:pPr>
-            <w:r>
-              <w:rPr>
-                <w:rFonts w:ascii="Times New Roman" w:hAnsi="Times New Roman"/>
+            <w:tcW w:w="1619" w:type="dxa"/>
+          </w:tcPr>
+          <w:p>
+            <w:pPr>
+              <w:pStyle w:val="Compact"/>
+              <w:keepNext/>
+              <w:spacing w:before="0" w:after="0"/>
+            </w:pPr>
+            <w:r>
+              <w:rPr>
                 <w:sz w:val="24"/>
               </w:rPr>
               <w:t>Контент</w:t>
@@ -1404,17 +1295,16 @@
         </w:tc>
         <w:tc>
           <w:tcPr>
-            <w:tcW w:w="4907" w:type="dxa"/>
-          </w:tcPr>
-          <w:p>
-            <w:pPr>
-              <w:pStyle w:val="Compact"/>
-              <w:spacing w:line="240" w:lineRule="auto"/>
-              <w:ind w:firstLine="0"/>
-            </w:pPr>
-            <w:r>
-              <w:rPr>
-                <w:rFonts w:ascii="Times New Roman" w:hAnsi="Times New Roman"/>
+            <w:tcW w:w="4645" w:type="dxa"/>
+          </w:tcPr>
+          <w:p>
+            <w:pPr>
+              <w:pStyle w:val="Compact"/>
+              <w:keepNext/>
+              <w:spacing w:before="0" w:after="0"/>
+            </w:pPr>
+            <w:r>
+              <w:rPr>
                 <w:sz w:val="24"/>
               </w:rPr>
               <w:t>Обещание, нотации, примеры, тарифы, доказательства, вопросы</w:t>
@@ -1423,17 +1313,16 @@
         </w:tc>
         <w:tc>
           <w:tcPr>
-            <w:tcW w:w="2981" w:type="dxa"/>
-          </w:tcPr>
-          <w:p>
-            <w:pPr>
-              <w:pStyle w:val="Compact"/>
-              <w:spacing w:line="240" w:lineRule="auto"/>
-              <w:ind w:firstLine="0"/>
-            </w:pPr>
-            <w:r>
-              <w:rPr>
-                <w:rFonts w:ascii="Times New Roman" w:hAnsi="Times New Roman"/>
+            <w:tcW w:w="3090" w:type="dxa"/>
+          </w:tcPr>
+          <w:p>
+            <w:pPr>
+              <w:pStyle w:val="Compact"/>
+              <w:keepNext/>
+              <w:spacing w:before="0" w:after="0"/>
+            </w:pPr>
+            <w:r>
+              <w:rPr>
                 <w:sz w:val="24"/>
               </w:rPr>
               <w:t>Кейсы, база знаний, обучающие материалы</w:t>
@@ -1447,17 +1336,16 @@
         </w:trPr>
         <w:tc>
           <w:tcPr>
-            <w:tcW w:w="1802" w:type="dxa"/>
-          </w:tcPr>
-          <w:p>
-            <w:pPr>
-              <w:pStyle w:val="Compact"/>
-              <w:spacing w:line="240" w:lineRule="auto"/>
-              <w:ind w:firstLine="0"/>
-            </w:pPr>
-            <w:r>
-              <w:rPr>
-                <w:rFonts w:ascii="Times New Roman" w:hAnsi="Times New Roman"/>
+            <w:tcW w:w="1619" w:type="dxa"/>
+          </w:tcPr>
+          <w:p>
+            <w:pPr>
+              <w:pStyle w:val="Compact"/>
+              <w:keepNext/>
+              <w:spacing w:before="0" w:after="0"/>
+            </w:pPr>
+            <w:r>
+              <w:rPr>
                 <w:sz w:val="24"/>
               </w:rPr>
               <w:t>Интеграции</w:t>
@@ -1466,17 +1354,16 @@
         </w:tc>
         <w:tc>
           <w:tcPr>
-            <w:tcW w:w="4907" w:type="dxa"/>
-          </w:tcPr>
-          <w:p>
-            <w:pPr>
-              <w:pStyle w:val="Compact"/>
-              <w:spacing w:line="240" w:lineRule="auto"/>
-              <w:ind w:firstLine="0"/>
-            </w:pPr>
-            <w:r>
-              <w:rPr>
-                <w:rFonts w:ascii="Times New Roman" w:hAnsi="Times New Roman"/>
+            <w:tcW w:w="4645" w:type="dxa"/>
+          </w:tcPr>
+          <w:p>
+            <w:pPr>
+              <w:pStyle w:val="Compact"/>
+              <w:keepNext/>
+              <w:spacing w:before="0" w:after="0"/>
+            </w:pPr>
+            <w:r>
+              <w:rPr>
                 <w:sz w:val="24"/>
               </w:rPr>
               <w:t>Платежный провайдер, аналитика событий</w:t>
@@ -1485,17 +1372,16 @@
         </w:tc>
         <w:tc>
           <w:tcPr>
-            <w:tcW w:w="2981" w:type="dxa"/>
-          </w:tcPr>
-          <w:p>
-            <w:pPr>
-              <w:pStyle w:val="Compact"/>
-              <w:spacing w:line="240" w:lineRule="auto"/>
-              <w:ind w:firstLine="0"/>
-            </w:pPr>
-            <w:r>
-              <w:rPr>
-                <w:rFonts w:ascii="Times New Roman" w:hAnsi="Times New Roman"/>
+            <w:tcW w:w="3090" w:type="dxa"/>
+          </w:tcPr>
+          <w:p>
+            <w:pPr>
+              <w:pStyle w:val="Compact"/>
+              <w:keepNext/>
+              <w:spacing w:before="0" w:after="0"/>
+            </w:pPr>
+            <w:r>
+              <w:rPr>
                 <w:sz w:val="24"/>
               </w:rPr>
               <w:t>API, внешние сервисы</w:t>
@@ -1509,17 +1395,15 @@
         </w:trPr>
         <w:tc>
           <w:tcPr>
-            <w:tcW w:w="1802" w:type="dxa"/>
-          </w:tcPr>
-          <w:p>
-            <w:pPr>
-              <w:pStyle w:val="Compact"/>
-              <w:spacing w:line="240" w:lineRule="auto"/>
-              <w:ind w:firstLine="0"/>
-            </w:pPr>
-            <w:r>
-              <w:rPr>
-                <w:rFonts w:ascii="Times New Roman" w:hAnsi="Times New Roman"/>
+            <w:tcW w:w="1619" w:type="dxa"/>
+          </w:tcPr>
+          <w:p>
+            <w:pPr>
+              <w:pStyle w:val="Compact"/>
+              <w:spacing w:before="0" w:after="0"/>
+            </w:pPr>
+            <w:r>
+              <w:rPr>
                 <w:sz w:val="24"/>
               </w:rPr>
               <w:t>Критерий готовности</w:t>
@@ -1528,47 +1412,34 @@
         </w:tc>
         <w:tc>
           <w:tcPr>
-            <w:tcW w:w="4907" w:type="dxa"/>
-          </w:tcPr>
-          <w:p>
-            <w:pPr>
-              <w:pStyle w:val="Compact"/>
-              <w:spacing w:line="240" w:lineRule="auto"/>
-              <w:ind w:firstLine="0"/>
-            </w:pPr>
-            <w:r>
-              <w:rPr>
-                <w:rFonts w:ascii="Times New Roman" w:hAnsi="Times New Roman"/>
-                <w:sz w:val="24"/>
-              </w:rPr>
-              <w:t xml:space="preserve">Пользователь строит диаграмму, понимает цену и оставляет заявку </w:t>
-            </w:r>
-            <w:r>
-              <w:rPr>
-                <w:rFonts w:ascii="Times New Roman" w:hAnsi="Times New Roman"/>
-                <w:sz w:val="24"/>
-              </w:rPr>
-              <w:lastRenderedPageBreak/>
-              <w:t>или платит</w:t>
-            </w:r>
-          </w:p>
-        </w:tc>
-        <w:tc>
-          <w:tcPr>
-            <w:tcW w:w="2981" w:type="dxa"/>
-          </w:tcPr>
-          <w:p>
-            <w:pPr>
-              <w:pStyle w:val="Compact"/>
-              <w:spacing w:line="240" w:lineRule="auto"/>
-              <w:ind w:firstLine="0"/>
-            </w:pPr>
-            <w:r>
-              <w:rPr>
-                <w:rFonts w:ascii="Times New Roman" w:hAnsi="Times New Roman"/>
-                <w:sz w:val="24"/>
-              </w:rPr>
-              <w:lastRenderedPageBreak/>
+            <w:tcW w:w="4645" w:type="dxa"/>
+          </w:tcPr>
+          <w:p>
+            <w:pPr>
+              <w:pStyle w:val="Compact"/>
+              <w:spacing w:before="0" w:after="0"/>
+            </w:pPr>
+            <w:r>
+              <w:rPr>
+                <w:sz w:val="24"/>
+              </w:rPr>
+              <w:t>Пользователь строит диаграмму, понимает цену и оставляет заявку или платит</w:t>
+            </w:r>
+          </w:p>
+        </w:tc>
+        <w:tc>
+          <w:tcPr>
+            <w:tcW w:w="3090" w:type="dxa"/>
+          </w:tcPr>
+          <w:p>
+            <w:pPr>
+              <w:pStyle w:val="Compact"/>
+              <w:spacing w:before="0" w:after="0"/>
+            </w:pPr>
+            <w:r>
+              <w:rPr>
+                <w:sz w:val="24"/>
+              </w:rPr>
               <w:t>Пользователь возвращается и расширяет использование</w:t>
             </w:r>
           </w:p>
@@ -1578,10 +1449,8 @@
     <w:p>
       <w:pPr>
         <w:pStyle w:val="2"/>
-        <w:keepNext/>
-        <w:spacing w:lineRule="exact" w:line="360" w:before="360" w:after="360"/>
+        <w:spacing w:before="360" w:after="360" w:line="360" w:lineRule="exact"/>
         <w:ind w:firstLine="709"/>
-        <w:jc w:val="left"/>
       </w:pPr>
       <w:bookmarkStart w:id="7" w:name="_6aa5956fb9cc99ee58ead69ad3ca17b045296db"/>
       <w:bookmarkEnd w:id="6"/>
@@ -1597,35 +1466,33 @@
     <w:tbl>
       <w:tblPr>
         <w:tblStyle w:val="Table"/>
-        <w:tblW w:w="9689" w:type="dxa"/>
+        <w:tblW w:w="9355" w:type="dxa"/>
         <w:tblLayout w:type="fixed"/>
         <w:tblLook w:val="0020" w:firstRow="1" w:lastRow="0" w:firstColumn="0" w:lastColumn="0" w:noHBand="0" w:noVBand="0"/>
       </w:tblPr>
       <w:tblGrid>
-        <w:gridCol w:w="1650"/>
-        <w:gridCol w:w="5445"/>
-        <w:gridCol w:w="2595"/>
+        <w:gridCol w:w="1349"/>
+        <w:gridCol w:w="5463"/>
+        <w:gridCol w:w="2543"/>
       </w:tblGrid>
       <w:tr>
         <w:trPr>
           <w:cnfStyle w:val="100000000000" w:firstRow="1" w:lastRow="0" w:firstColumn="0" w:lastColumn="0" w:oddVBand="0" w:evenVBand="0" w:oddHBand="0" w:evenHBand="0" w:firstRowFirstColumn="0" w:firstRowLastColumn="0" w:lastRowFirstColumn="0" w:lastRowLastColumn="0"/>
+          <w:cantSplit/>
           <w:tblHeader/>
-          <w:cantSplit/>
         </w:trPr>
         <w:tc>
           <w:tcPr>
-            <w:tcW w:w="1650" w:type="dxa"/>
-          </w:tcPr>
-          <w:p>
-            <w:pPr>
-              <w:pStyle w:val="Compact"/>
-              <w:keepNext/>
-              <w:spacing w:line="240" w:lineRule="auto"/>
-              <w:ind w:firstLine="0"/>
-            </w:pPr>
-            <w:r>
-              <w:rPr>
-                <w:rFonts w:ascii="Times New Roman" w:hAnsi="Times New Roman"/>
+            <w:tcW w:w="1349" w:type="dxa"/>
+          </w:tcPr>
+          <w:p>
+            <w:pPr>
+              <w:pStyle w:val="Compact"/>
+              <w:keepNext/>
+              <w:spacing w:before="0" w:after="0"/>
+            </w:pPr>
+            <w:r>
+              <w:rPr>
                 <w:sz w:val="24"/>
               </w:rPr>
               <w:t>Блок</w:t>
@@ -1634,18 +1501,16 @@
         </w:tc>
         <w:tc>
           <w:tcPr>
-            <w:tcW w:w="5445" w:type="dxa"/>
-          </w:tcPr>
-          <w:p>
-            <w:pPr>
-              <w:pStyle w:val="Compact"/>
-              <w:keepNext/>
-              <w:spacing w:line="240" w:lineRule="auto"/>
-              <w:ind w:firstLine="0"/>
-            </w:pPr>
-            <w:r>
-              <w:rPr>
-                <w:rFonts w:ascii="Times New Roman" w:hAnsi="Times New Roman"/>
+            <w:tcW w:w="5462" w:type="dxa"/>
+          </w:tcPr>
+          <w:p>
+            <w:pPr>
+              <w:pStyle w:val="Compact"/>
+              <w:keepNext/>
+              <w:spacing w:before="0" w:after="0"/>
+            </w:pPr>
+            <w:r>
+              <w:rPr>
                 <w:sz w:val="24"/>
               </w:rPr>
               <w:t>Показатель</w:t>
@@ -1654,18 +1519,16 @@
         </w:tc>
         <w:tc>
           <w:tcPr>
-            <w:tcW w:w="2595" w:type="dxa"/>
-          </w:tcPr>
-          <w:p>
-            <w:pPr>
-              <w:pStyle w:val="Compact"/>
-              <w:keepNext/>
-              <w:spacing w:line="240" w:lineRule="auto"/>
-              <w:ind w:firstLine="0"/>
-            </w:pPr>
-            <w:r>
-              <w:rPr>
-                <w:rFonts w:ascii="Times New Roman" w:hAnsi="Times New Roman"/>
+            <w:tcW w:w="2543" w:type="dxa"/>
+          </w:tcPr>
+          <w:p>
+            <w:pPr>
+              <w:pStyle w:val="Compact"/>
+              <w:keepNext/>
+              <w:spacing w:before="0" w:after="0"/>
+            </w:pPr>
+            <w:r>
+              <w:rPr>
                 <w:sz w:val="24"/>
               </w:rPr>
               <w:t>Плановое значение</w:t>
@@ -1679,18 +1542,16 @@
         </w:trPr>
         <w:tc>
           <w:tcPr>
-            <w:tcW w:w="1650" w:type="dxa"/>
-          </w:tcPr>
-          <w:p>
-            <w:pPr>
-              <w:pStyle w:val="Compact"/>
-              <w:keepNext/>
-              <w:spacing w:line="240" w:lineRule="auto"/>
-              <w:ind w:firstLine="0"/>
-            </w:pPr>
-            <w:r>
-              <w:rPr>
-                <w:rFonts w:ascii="Times New Roman" w:hAnsi="Times New Roman"/>
+            <w:tcW w:w="1349" w:type="dxa"/>
+          </w:tcPr>
+          <w:p>
+            <w:pPr>
+              <w:pStyle w:val="Compact"/>
+              <w:keepNext/>
+              <w:spacing w:before="0" w:after="0"/>
+            </w:pPr>
+            <w:r>
+              <w:rPr>
                 <w:sz w:val="24"/>
               </w:rPr>
               <w:t>Спрос</w:t>
@@ -1699,18 +1560,16 @@
         </w:tc>
         <w:tc>
           <w:tcPr>
-            <w:tcW w:w="5445" w:type="dxa"/>
-          </w:tcPr>
-          <w:p>
-            <w:pPr>
-              <w:pStyle w:val="Compact"/>
-              <w:keepNext/>
-              <w:spacing w:line="240" w:lineRule="auto"/>
-              <w:ind w:firstLine="0"/>
-            </w:pPr>
-            <w:r>
-              <w:rPr>
-                <w:rFonts w:ascii="Times New Roman" w:hAnsi="Times New Roman"/>
+            <w:tcW w:w="5462" w:type="dxa"/>
+          </w:tcPr>
+          <w:p>
+            <w:pPr>
+              <w:pStyle w:val="Compact"/>
+              <w:keepNext/>
+              <w:spacing w:before="0" w:after="0"/>
+            </w:pPr>
+            <w:r>
+              <w:rPr>
                 <w:sz w:val="24"/>
               </w:rPr>
               <w:t>Зарегистрированные пользователи за первый год</w:t>
@@ -1719,18 +1578,16 @@
         </w:tc>
         <w:tc>
           <w:tcPr>
-            <w:tcW w:w="2595" w:type="dxa"/>
-          </w:tcPr>
-          <w:p>
-            <w:pPr>
-              <w:pStyle w:val="Compact"/>
-              <w:keepNext/>
-              <w:spacing w:line="240" w:lineRule="auto"/>
-              <w:ind w:firstLine="0"/>
-            </w:pPr>
-            <w:r>
-              <w:rPr>
-                <w:rFonts w:ascii="Times New Roman" w:hAnsi="Times New Roman"/>
+            <w:tcW w:w="2543" w:type="dxa"/>
+          </w:tcPr>
+          <w:p>
+            <w:pPr>
+              <w:pStyle w:val="Compact"/>
+              <w:keepNext/>
+              <w:spacing w:before="0" w:after="0"/>
+            </w:pPr>
+            <w:r>
+              <w:rPr>
                 <w:sz w:val="24"/>
               </w:rPr>
               <w:t>1 500</w:t>
@@ -1744,17 +1601,16 @@
         </w:trPr>
         <w:tc>
           <w:tcPr>
-            <w:tcW w:w="1650" w:type="dxa"/>
-          </w:tcPr>
-          <w:p>
-            <w:pPr>
-              <w:pStyle w:val="Compact"/>
-              <w:spacing w:line="240" w:lineRule="auto"/>
-              <w:ind w:firstLine="0"/>
-            </w:pPr>
-            <w:r>
-              <w:rPr>
-                <w:rFonts w:ascii="Times New Roman" w:hAnsi="Times New Roman"/>
+            <w:tcW w:w="1349" w:type="dxa"/>
+          </w:tcPr>
+          <w:p>
+            <w:pPr>
+              <w:pStyle w:val="Compact"/>
+              <w:keepNext/>
+              <w:spacing w:before="0" w:after="0"/>
+            </w:pPr>
+            <w:r>
+              <w:rPr>
                 <w:sz w:val="24"/>
               </w:rPr>
               <w:t>Конверсия</w:t>
@@ -1763,17 +1619,16 @@
         </w:tc>
         <w:tc>
           <w:tcPr>
-            <w:tcW w:w="5445" w:type="dxa"/>
-          </w:tcPr>
-          <w:p>
-            <w:pPr>
-              <w:pStyle w:val="Compact"/>
-              <w:spacing w:line="240" w:lineRule="auto"/>
-              <w:ind w:firstLine="0"/>
-            </w:pPr>
-            <w:r>
-              <w:rPr>
-                <w:rFonts w:ascii="Times New Roman" w:hAnsi="Times New Roman"/>
+            <w:tcW w:w="5462" w:type="dxa"/>
+          </w:tcPr>
+          <w:p>
+            <w:pPr>
+              <w:pStyle w:val="Compact"/>
+              <w:keepNext/>
+              <w:spacing w:before="0" w:after="0"/>
+            </w:pPr>
+            <w:r>
+              <w:rPr>
                 <w:sz w:val="24"/>
               </w:rPr>
               <w:t>Активация (первый Run в первый день); конверсия Free в Pro</w:t>
@@ -1782,17 +1637,16 @@
         </w:tc>
         <w:tc>
           <w:tcPr>
-            <w:tcW w:w="2595" w:type="dxa"/>
-          </w:tcPr>
-          <w:p>
-            <w:pPr>
-              <w:pStyle w:val="Compact"/>
-              <w:spacing w:line="240" w:lineRule="auto"/>
-              <w:ind w:firstLine="0"/>
-            </w:pPr>
-            <w:r>
-              <w:rPr>
-                <w:rFonts w:ascii="Times New Roman" w:hAnsi="Times New Roman"/>
+            <w:tcW w:w="2543" w:type="dxa"/>
+          </w:tcPr>
+          <w:p>
+            <w:pPr>
+              <w:pStyle w:val="Compact"/>
+              <w:keepNext/>
+              <w:spacing w:before="0" w:after="0"/>
+            </w:pPr>
+            <w:r>
+              <w:rPr>
                 <w:sz w:val="24"/>
               </w:rPr>
               <w:t>не менее 60 %; 3 %</w:t>
@@ -1806,17 +1660,16 @@
         </w:trPr>
         <w:tc>
           <w:tcPr>
-            <w:tcW w:w="1650" w:type="dxa"/>
-          </w:tcPr>
-          <w:p>
-            <w:pPr>
-              <w:pStyle w:val="Compact"/>
-              <w:spacing w:line="240" w:lineRule="auto"/>
-              <w:ind w:firstLine="0"/>
-            </w:pPr>
-            <w:r>
-              <w:rPr>
-                <w:rFonts w:ascii="Times New Roman" w:hAnsi="Times New Roman"/>
+            <w:tcW w:w="1349" w:type="dxa"/>
+          </w:tcPr>
+          <w:p>
+            <w:pPr>
+              <w:pStyle w:val="Compact"/>
+              <w:keepNext/>
+              <w:spacing w:before="0" w:after="0"/>
+            </w:pPr>
+            <w:r>
+              <w:rPr>
                 <w:sz w:val="24"/>
               </w:rPr>
               <w:t>Экономика</w:t>
@@ -1825,17 +1678,16 @@
         </w:tc>
         <w:tc>
           <w:tcPr>
-            <w:tcW w:w="5445" w:type="dxa"/>
-          </w:tcPr>
-          <w:p>
-            <w:pPr>
-              <w:pStyle w:val="Compact"/>
-              <w:spacing w:line="240" w:lineRule="auto"/>
-              <w:ind w:firstLine="0"/>
-            </w:pPr>
-            <w:r>
-              <w:rPr>
-                <w:rFonts w:ascii="Times New Roman" w:hAnsi="Times New Roman"/>
+            <w:tcW w:w="5462" w:type="dxa"/>
+          </w:tcPr>
+          <w:p>
+            <w:pPr>
+              <w:pStyle w:val="Compact"/>
+              <w:keepNext/>
+              <w:spacing w:before="0" w:after="0"/>
+            </w:pPr>
+            <w:r>
+              <w:rPr>
                 <w:sz w:val="24"/>
               </w:rPr>
               <w:t>ARPPU в месяц; денежные расходы MVP</w:t>
@@ -1844,17 +1696,16 @@
         </w:tc>
         <w:tc>
           <w:tcPr>
-            <w:tcW w:w="2595" w:type="dxa"/>
-          </w:tcPr>
-          <w:p>
-            <w:pPr>
-              <w:pStyle w:val="Compact"/>
-              <w:spacing w:line="240" w:lineRule="auto"/>
-              <w:ind w:firstLine="0"/>
-            </w:pPr>
-            <w:r>
-              <w:rPr>
-                <w:rFonts w:ascii="Times New Roman" w:hAnsi="Times New Roman"/>
+            <w:tcW w:w="2543" w:type="dxa"/>
+          </w:tcPr>
+          <w:p>
+            <w:pPr>
+              <w:pStyle w:val="Compact"/>
+              <w:keepNext/>
+              <w:spacing w:before="0" w:after="0"/>
+            </w:pPr>
+            <w:r>
+              <w:rPr>
                 <w:sz w:val="24"/>
               </w:rPr>
               <w:t>4 USD; 0 (бесплатные тарифы)</w:t>
@@ -1868,17 +1719,16 @@
         </w:trPr>
         <w:tc>
           <w:tcPr>
-            <w:tcW w:w="1650" w:type="dxa"/>
-          </w:tcPr>
-          <w:p>
-            <w:pPr>
-              <w:pStyle w:val="Compact"/>
-              <w:spacing w:line="240" w:lineRule="auto"/>
-              <w:ind w:firstLine="0"/>
-            </w:pPr>
-            <w:r>
-              <w:rPr>
-                <w:rFonts w:ascii="Times New Roman" w:hAnsi="Times New Roman"/>
+            <w:tcW w:w="1349" w:type="dxa"/>
+          </w:tcPr>
+          <w:p>
+            <w:pPr>
+              <w:pStyle w:val="Compact"/>
+              <w:keepNext/>
+              <w:spacing w:before="0" w:after="0"/>
+            </w:pPr>
+            <w:r>
+              <w:rPr>
                 <w:sz w:val="24"/>
               </w:rPr>
               <w:t>Удержание</w:t>
@@ -1887,17 +1737,16 @@
         </w:tc>
         <w:tc>
           <w:tcPr>
-            <w:tcW w:w="5445" w:type="dxa"/>
-          </w:tcPr>
-          <w:p>
-            <w:pPr>
-              <w:pStyle w:val="Compact"/>
-              <w:spacing w:line="240" w:lineRule="auto"/>
-              <w:ind w:firstLine="0"/>
-            </w:pPr>
-            <w:r>
-              <w:rPr>
-                <w:rFonts w:ascii="Times New Roman" w:hAnsi="Times New Roman"/>
+            <w:tcW w:w="5462" w:type="dxa"/>
+          </w:tcPr>
+          <w:p>
+            <w:pPr>
+              <w:pStyle w:val="Compact"/>
+              <w:keepNext/>
+              <w:spacing w:before="0" w:after="0"/>
+            </w:pPr>
+            <w:r>
+              <w:rPr>
                 <w:sz w:val="24"/>
               </w:rPr>
               <w:t>Возврат на 7 и 30 день; отток Pro</w:t>
@@ -1906,17 +1755,16 @@
         </w:tc>
         <w:tc>
           <w:tcPr>
-            <w:tcW w:w="2595" w:type="dxa"/>
-          </w:tcPr>
-          <w:p>
-            <w:pPr>
-              <w:pStyle w:val="Compact"/>
-              <w:spacing w:line="240" w:lineRule="auto"/>
-              <w:ind w:firstLine="0"/>
-            </w:pPr>
-            <w:r>
-              <w:rPr>
-                <w:rFonts w:ascii="Times New Roman" w:hAnsi="Times New Roman"/>
+            <w:tcW w:w="2543" w:type="dxa"/>
+          </w:tcPr>
+          <w:p>
+            <w:pPr>
+              <w:pStyle w:val="Compact"/>
+              <w:keepNext/>
+              <w:spacing w:before="0" w:after="0"/>
+            </w:pPr>
+            <w:r>
+              <w:rPr>
                 <w:sz w:val="24"/>
               </w:rPr>
               <w:t>30 % и 15 %; не более 8 %</w:t>
@@ -1930,17 +1778,15 @@
         </w:trPr>
         <w:tc>
           <w:tcPr>
-            <w:tcW w:w="1650" w:type="dxa"/>
-          </w:tcPr>
-          <w:p>
-            <w:pPr>
-              <w:pStyle w:val="Compact"/>
-              <w:spacing w:line="240" w:lineRule="auto"/>
-              <w:ind w:firstLine="0"/>
-            </w:pPr>
-            <w:r>
-              <w:rPr>
-                <w:rFonts w:ascii="Times New Roman" w:hAnsi="Times New Roman"/>
+            <w:tcW w:w="1349" w:type="dxa"/>
+          </w:tcPr>
+          <w:p>
+            <w:pPr>
+              <w:pStyle w:val="Compact"/>
+              <w:spacing w:before="0" w:after="0"/>
+            </w:pPr>
+            <w:r>
+              <w:rPr>
                 <w:sz w:val="24"/>
               </w:rPr>
               <w:t>Риски</w:t>
@@ -1949,17 +1795,15 @@
         </w:tc>
         <w:tc>
           <w:tcPr>
-            <w:tcW w:w="5445" w:type="dxa"/>
-          </w:tcPr>
-          <w:p>
-            <w:pPr>
-              <w:pStyle w:val="Compact"/>
-              <w:spacing w:line="240" w:lineRule="auto"/>
-              <w:ind w:firstLine="0"/>
-            </w:pPr>
-            <w:r>
-              <w:rPr>
-                <w:rFonts w:ascii="Times New Roman" w:hAnsi="Times New Roman"/>
+            <w:tcW w:w="5462" w:type="dxa"/>
+          </w:tcPr>
+          <w:p>
+            <w:pPr>
+              <w:pStyle w:val="Compact"/>
+              <w:spacing w:before="0" w:after="0"/>
+            </w:pPr>
+            <w:r>
+              <w:rPr>
                 <w:sz w:val="24"/>
               </w:rPr>
               <w:t>Разбор нотаций, платежный провайдер, снижение спроса, бесплатный заменитель</w:t>
@@ -1968,17 +1812,15 @@
         </w:tc>
         <w:tc>
           <w:tcPr>
-            <w:tcW w:w="2595" w:type="dxa"/>
-          </w:tcPr>
-          <w:p>
-            <w:pPr>
-              <w:pStyle w:val="Compact"/>
-              <w:spacing w:line="240" w:lineRule="auto"/>
-              <w:ind w:firstLine="0"/>
-            </w:pPr>
-            <w:r>
-              <w:rPr>
-                <w:rFonts w:ascii="Times New Roman" w:hAnsi="Times New Roman"/>
+            <w:tcW w:w="2543" w:type="dxa"/>
+          </w:tcPr>
+          <w:p>
+            <w:pPr>
+              <w:pStyle w:val="Compact"/>
+              <w:spacing w:before="0" w:after="0"/>
+            </w:pPr>
+            <w:r>
+              <w:rPr>
                 <w:sz w:val="24"/>
               </w:rPr>
               <w:t>Ограничить пилот и инвестиции</w:t>
@@ -1990,10 +1832,8 @@
     <w:p>
       <w:pPr>
         <w:pStyle w:val="2"/>
-        <w:keepNext/>
-        <w:spacing w:lineRule="exact" w:line="360" w:before="360" w:after="360"/>
+        <w:spacing w:before="360" w:after="360" w:line="360" w:lineRule="exact"/>
         <w:ind w:firstLine="709"/>
-        <w:jc w:val="left"/>
       </w:pPr>
       <w:bookmarkStart w:id="8" w:name="_3db72adc2b29448a26ffbfe29ab97a412b51294"/>
       <w:bookmarkEnd w:id="7"/>
@@ -2009,25 +1849,19 @@
     <w:p>
       <w:pPr>
         <w:pStyle w:val="FirstParagraph"/>
-        <w:spacing w:lineRule="exact" w:line="360" w:before="0" w:after="0"/>
+        <w:spacing w:before="0" w:after="0" w:line="360" w:lineRule="exact"/>
         <w:ind w:firstLine="709"/>
         <w:jc w:val="both"/>
       </w:pPr>
       <w:r>
-        <w:rPr>
-          <w:rFonts w:ascii="Times New Roman" w:hAnsi="Times New Roman"/>
-          <w:sz w:val="28"/>
-        </w:rPr>
         <w:t>Пилот: ограниченный запуск первого релиза для студентов вузов Беларуси, поскольку ЦП перспективно, но нужно проверить готовность платить и причину снижения спроса. Критерий продолжения: достигнуты пороги метрик (активация не менее 60 %, D7 30 %, конверсия в Pro 3 %) и подтверждена готовность платить за Pro. Объем пилота ограничен 610 ч работы и нулевым бюджетом инфраструктуры, срок MVP – до 06.12.2026.</w:t>
       </w:r>
     </w:p>
     <w:p>
       <w:pPr>
         <w:pStyle w:val="2"/>
-        <w:keepNext/>
-        <w:spacing w:lineRule="exact" w:line="360" w:before="360" w:after="360"/>
+        <w:spacing w:before="360" w:after="360" w:line="360" w:lineRule="exact"/>
         <w:ind w:firstLine="709"/>
-        <w:jc w:val="left"/>
       </w:pPr>
       <w:bookmarkStart w:id="9" w:name="_6764a588ccca92f509b06245335571106639b30"/>
       <w:bookmarkEnd w:id="8"/>
@@ -2043,23 +1877,21 @@
     <w:p>
       <w:pPr>
         <w:pStyle w:val="FirstParagraph"/>
-        <w:spacing w:lineRule="exact" w:line="360" w:before="0" w:after="0"/>
+        <w:spacing w:before="0" w:after="0" w:line="360" w:lineRule="exact"/>
         <w:ind w:firstLine="709"/>
         <w:jc w:val="both"/>
       </w:pPr>
       <w:r>
-        <w:rPr>
-          <w:rFonts w:ascii="Times New Roman" w:hAnsi="Times New Roman"/>
-          <w:sz w:val="28"/>
-        </w:rPr>
-        <w:t>Проект NotaCode целесообразно рассматривать как веб-платформу «диаграммы как код» для студентов технических специальностей и аналитиков ПО. Его ценность основана на решении проблемы отсутствия единого набора нотаций, подтвержденной страницами восьми конкурентов. Первый релиз должен быть ограничен редактором нотаций волны 1, экспортом, тарифами, регистрацией и оплатой, которые сохраняют ключевое ценностное обещание и позволяют проверить спрос, оплату и удержание. Инвестиционное решение: пилот при условиях проверки готовности платить, выяснения причины снижения спроса и составления сметы.</w:t>
+        <w:t xml:space="preserve">Проект NotaCode целесообразно рассматривать как веб-платформу «диаграммы как код» для студентов технических специальностей и аналитиков </w:t>
+      </w:r>
+      <w:r>
+        <w:lastRenderedPageBreak/>
+        <w:t>ПО. Его ценность основана на решении проблемы отсутствия единого набора нотаций, подтвержденной страницами восьми конкурентов. Первый релиз должен быть ограничен редактором нотаций волны 1, экспортом, тарифами, регистрацией и оплатой, которые сохраняют ключевое ценностное обещание и позволяют проверить спрос, оплату и удержание. Инвестиционное решение: пилот при условиях проверки готовности платить, выяснения причины снижения спроса и составления сметы.</w:t>
       </w:r>
       <w:bookmarkEnd w:id="0"/>
       <w:bookmarkEnd w:id="9"/>
     </w:p>
     <w:sectPr>
-      <w:headerReference w:type="default" r:id="rId7"/>
-      <w:footerReference w:type="default" r:id="rId8"/>
       <w:footnotePr>
         <w:numRestart w:val="eachSect"/>
       </w:footnotePr>
@@ -2096,12 +1928,6 @@
 </w:endnotes>
 </file>
 
-<file path=word/footer1.xml><?xml version="1.0" encoding="utf-8"?>
-<w:ftr xmlns:wpc="http://schemas.microsoft.com/office/word/2010/wordprocessingCanvas" xmlns:cx="http://schemas.microsoft.com/office/drawing/2014/chartex" xmlns:cx1="http://schemas.microsoft.com/office/drawing/2015/9/8/chartex" xmlns:cx2="http://schemas.microsoft.com/office/drawing/2015/10/21/chartex" xmlns:cx3="http://schemas.microsoft.com/office/drawing/2016/5/9/chartex" xmlns:cx4="http://schemas.microsoft.com/office/drawing/2016/5/10/chartex" xmlns:cx5="http://schemas.microsoft.com/office/drawing/2016/5/11/chartex" xmlns:cx6="http://schemas.microsoft.com/office/drawing/2016/5/12/chartex" xmlns:cx7="http://schemas.microsoft.com/office/drawing/2016/5/13/chartex" xmlns:cx8="http://schemas.microsoft.com/office/drawing/2016/5/14/chartex" xmlns:mc="http://schemas.openxmlformats.org/markup-compatibility/2006" xmlns:aink="http://schemas.microsoft.com/office/drawing/2016/ink" xmlns:am3d="http://schemas.microsoft.com/office/drawing/2017/model3d" xmlns:o="urn:schemas-microsoft-com:office:office" xmlns:oel="http://schemas.microsoft.com/office/2019/extlst" xmlns:r="http://schemas.openxmlformats.org/officeDocument/2006/relationships" xmlns:m="http://schemas.openxmlformats.org/officeDocument/2006/math" xmlns:v="urn:schemas-microsoft-com:vml" xmlns:wp14="http://schemas.microsoft.com/office/word/2010/wordprocessingDrawing" xmlns:wp="http://schemas.openxmlformats.org/drawingml/2006/wordprocessingDrawing" xmlns:w10="urn:schemas-microsoft-com:office:word" xmlns:w="http://schemas.openxmlformats.org/wordprocessingml/2006/main" xmlns:w14="http://schemas.microsoft.com/office/word/2010/wordml" xmlns:w15="http://schemas.microsoft.com/office/word/2012/wordml" xmlns:w16cex="http://schemas.microsoft.com/office/word/2018/wordml/cex" xmlns:w16cid="http://schemas.microsoft.com/office/word/2016/wordml/cid" xmlns:w16="http://schemas.microsoft.com/office/word/2018/wordml" xmlns:w16du="http://schemas.microsoft.com/office/word/2023/wordml/word16du" xmlns:w16sdtdh="http://schemas.microsoft.com/office/word/2020/wordml/sdtdatahash" xmlns:w16sdtfl="http://schemas.microsoft.com/office/word/2024/wordml/sdtformatlock" xmlns:w16se="http://schemas.microsoft.com/office/word/2015/wordml/symex" xmlns:wpg="http://schemas.microsoft.com/office/word/2010/wordprocessingGroup" xmlns:wpi="http://schemas.microsoft.com/office/word/2010/wordprocessingInk" xmlns:wne="http://schemas.microsoft.com/office/word/2006/wordml" xmlns:wps="http://schemas.microsoft.com/office/word/2010/wordprocessingShape" mc:Ignorable="w14 w15 w16se w16cid w16 w16cex w16sdtdh w16sdtfl w16du wp14">
-  <w:p/>
-</w:ftr>
-</file>
-
 <file path=word/footnotes.xml><?xml version="1.0" encoding="utf-8"?>
 <w:footnotes xmlns:wpc="http://schemas.microsoft.com/office/word/2010/wordprocessingCanvas" xmlns:cx="http://schemas.microsoft.com/office/drawing/2014/chartex" xmlns:cx1="http://schemas.microsoft.com/office/drawing/2015/9/8/chartex" xmlns:cx2="http://schemas.microsoft.com/office/drawing/2015/10/21/chartex" xmlns:cx3="http://schemas.microsoft.com/office/drawing/2016/5/9/chartex" xmlns:cx4="http://schemas.microsoft.com/office/drawing/2016/5/10/chartex" xmlns:cx5="http://schemas.microsoft.com/office/drawing/2016/5/11/chartex" xmlns:cx6="http://schemas.microsoft.com/office/drawing/2016/5/12/chartex" xmlns:cx7="http://schemas.microsoft.com/office/drawing/2016/5/13/chartex" xmlns:cx8="http://schemas.microsoft.com/office/drawing/2016/5/14/chartex" xmlns:mc="http://schemas.openxmlformats.org/markup-compatibility/2006" xmlns:aink="http://schemas.microsoft.com/office/drawing/2016/ink" xmlns:am3d="http://schemas.microsoft.com/office/drawing/2017/model3d" xmlns:o="urn:schemas-microsoft-com:office:office" xmlns:oel="http://schemas.microsoft.com/office/2019/extlst" xmlns:r="http://schemas.openxmlformats.org/officeDocument/2006/relationships" xmlns:m="http://schemas.openxmlformats.org/officeDocument/2006/math" xmlns:v="urn:schemas-microsoft-com:vml" xmlns:wp14="http://schemas.microsoft.com/office/word/2010/wordprocessingDrawing" xmlns:wp="http://schemas.openxmlformats.org/drawingml/2006/wordprocessingDrawing" xmlns:w10="urn:schemas-microsoft-com:office:word" xmlns:w="http://schemas.openxmlformats.org/wordprocessingml/2006/main" xmlns:w14="http://schemas.microsoft.com/office/word/2010/wordml" xmlns:w15="http://schemas.microsoft.com/office/word/2012/wordml" xmlns:w16cex="http://schemas.microsoft.com/office/word/2018/wordml/cex" xmlns:w16cid="http://schemas.microsoft.com/office/word/2016/wordml/cid" xmlns:w16="http://schemas.microsoft.com/office/word/2018/wordml" xmlns:w16du="http://schemas.microsoft.com/office/word/2023/wordml/word16du" xmlns:w16sdtdh="http://schemas.microsoft.com/office/word/2020/wordml/sdtdatahash" xmlns:w16sdtfl="http://schemas.microsoft.com/office/word/2024/wordml/sdtformatlock" xmlns:w16se="http://schemas.microsoft.com/office/word/2015/wordml/symex" xmlns:wpg="http://schemas.microsoft.com/office/word/2010/wordprocessingGroup" xmlns:wpi="http://schemas.microsoft.com/office/word/2010/wordprocessingInk" xmlns:wne="http://schemas.microsoft.com/office/word/2006/wordml" xmlns:wps="http://schemas.microsoft.com/office/word/2010/wordprocessingShape" mc:Ignorable="w14 w15 w16se w16cid w16 w16cex w16sdtdh w16sdtfl w16du wp14">
   <w:footnote w:type="separator" w:id="-1">
@@ -2125,12 +1951,6 @@
     </w:p>
   </w:footnote>
 </w:footnotes>
-</file>
-
-<file path=word/header1.xml><?xml version="1.0" encoding="utf-8"?>
-<w:hdr xmlns:wpc="http://schemas.microsoft.com/office/word/2010/wordprocessingCanvas" xmlns:cx="http://schemas.microsoft.com/office/drawing/2014/chartex" xmlns:cx1="http://schemas.microsoft.com/office/drawing/2015/9/8/chartex" xmlns:cx2="http://schemas.microsoft.com/office/drawing/2015/10/21/chartex" xmlns:cx3="http://schemas.microsoft.com/office/drawing/2016/5/9/chartex" xmlns:cx4="http://schemas.microsoft.com/office/drawing/2016/5/10/chartex" xmlns:cx5="http://schemas.microsoft.com/office/drawing/2016/5/11/chartex" xmlns:cx6="http://schemas.microsoft.com/office/drawing/2016/5/12/chartex" xmlns:cx7="http://schemas.microsoft.com/office/drawing/2016/5/13/chartex" xmlns:cx8="http://schemas.microsoft.com/office/drawing/2016/5/14/chartex" xmlns:mc="http://schemas.openxmlformats.org/markup-compatibility/2006" xmlns:aink="http://schemas.microsoft.com/office/drawing/2016/ink" xmlns:am3d="http://schemas.microsoft.com/office/drawing/2017/model3d" xmlns:o="urn:schemas-microsoft-com:office:office" xmlns:oel="http://schemas.microsoft.com/office/2019/extlst" xmlns:r="http://schemas.openxmlformats.org/officeDocument/2006/relationships" xmlns:m="http://schemas.openxmlformats.org/officeDocument/2006/math" xmlns:v="urn:schemas-microsoft-com:vml" xmlns:wp14="http://schemas.microsoft.com/office/word/2010/wordprocessingDrawing" xmlns:wp="http://schemas.openxmlformats.org/drawingml/2006/wordprocessingDrawing" xmlns:w10="urn:schemas-microsoft-com:office:word" xmlns:w="http://schemas.openxmlformats.org/wordprocessingml/2006/main" xmlns:w14="http://schemas.microsoft.com/office/word/2010/wordml" xmlns:w15="http://schemas.microsoft.com/office/word/2012/wordml" xmlns:w16cex="http://schemas.microsoft.com/office/word/2018/wordml/cex" xmlns:w16cid="http://schemas.microsoft.com/office/word/2016/wordml/cid" xmlns:w16="http://schemas.microsoft.com/office/word/2018/wordml" xmlns:w16du="http://schemas.microsoft.com/office/word/2023/wordml/word16du" xmlns:w16sdtdh="http://schemas.microsoft.com/office/word/2020/wordml/sdtdatahash" xmlns:w16sdtfl="http://schemas.microsoft.com/office/word/2024/wordml/sdtformatlock" xmlns:w16se="http://schemas.microsoft.com/office/word/2015/wordml/symex" xmlns:wpg="http://schemas.microsoft.com/office/word/2010/wordprocessingGroup" xmlns:wpi="http://schemas.microsoft.com/office/word/2010/wordprocessingInk" xmlns:wne="http://schemas.microsoft.com/office/word/2006/wordml" xmlns:wps="http://schemas.microsoft.com/office/word/2010/wordprocessingShape" mc:Ignorable="w14 w15 w16se w16cid w16 w16cex w16sdtdh w16sdtfl w16du wp14">
-  <w:p/>
-</w:hdr>
 </file>
 
 <file path=word/numbering.xml><?xml version="1.0" encoding="utf-8"?>
@@ -2483,7 +2303,7 @@
     <w:name w:val="Normal"/>
     <w:qFormat/>
     <w:rPr>
-      <w:rFonts w:ascii="Times New Roman" w:hAnsi="Times New Roman" w:eastAsia="Times New Roman"/>
+      <w:rFonts w:ascii="Times New Roman" w:eastAsia="Times New Roman" w:hAnsi="Times New Roman"/>
       <w:sz w:val="28"/>
     </w:rPr>
   </w:style>
@@ -2503,7 +2323,6 @@
     </w:pPr>
     <w:rPr>
       <w:rFonts w:asciiTheme="majorHAnsi" w:eastAsiaTheme="majorEastAsia" w:hAnsiTheme="majorHAnsi" w:cstheme="majorBidi"/>
-      <w:caps/>
       <w:color w:val="0F4761" w:themeColor="accent1" w:themeShade="BF"/>
       <w:sz w:val="40"/>
       <w:szCs w:val="40"/>
@@ -2551,7 +2370,6 @@
     <w:rPr>
       <w:rFonts w:eastAsiaTheme="majorEastAsia" w:cstheme="majorBidi"/>
       <w:color w:val="0F4761" w:themeColor="accent1" w:themeShade="BF"/>
-      <w:sz w:val="28"/>
       <w:szCs w:val="28"/>
     </w:rPr>
   </w:style>

</xml_diff>

<commit_message>
feat: rebuilt reports with Latin-only italics, numbered lists, VAK RB sources, reference text before and a paragraph after tables and figures, zero side indents
</commit_message>
<xml_diff>
--- a/ПРОВЕРИТЬ_ОТЧЕТЫ/РЕЗЮМЕ_ПРОЕКТА_NotaCode.docx
+++ b/ПРОВЕРИТЬ_ОТЧЕТЫ/РЕЗЮМЕ_ПРОЕКТА_NotaCode.docx
@@ -15,7 +15,16 @@
           <w:b/>
           <w:sz w:val="28"/>
         </w:rPr>
-        <w:t>КРАТКОЕ РЕЗЮМЕ ПРОЕКТА NOTACODE</w:t>
+        <w:t xml:space="preserve">КРАТКОЕ РЕЗЮМЕ ПРОЕКТА </w:t>
+      </w:r>
+      <w:r>
+        <w:rPr>
+          <w:rFonts w:ascii="Times New Roman" w:hAnsi="Times New Roman"/>
+          <w:b/>
+          <w:i/>
+          <w:sz w:val="28"/>
+        </w:rPr>
+        <w:t>NOTACODE</w:t>
       </w:r>
     </w:p>
     <w:p>
@@ -42,8 +51,8 @@
         <w:tblLook w:val="0020" w:firstRow="1" w:lastRow="0" w:firstColumn="0" w:lastColumn="0" w:noHBand="0" w:noVBand="0"/>
       </w:tblPr>
       <w:tblGrid>
-        <w:gridCol w:w="2217"/>
-        <w:gridCol w:w="7138"/>
+        <w:gridCol w:w="2432"/>
+        <w:gridCol w:w="6923"/>
       </w:tblGrid>
       <w:tr>
         <w:trPr>
@@ -53,7 +62,7 @@
         </w:trPr>
         <w:tc>
           <w:tcPr>
-            <w:tcW w:w="2217" w:type="dxa"/>
+            <w:tcW w:w="2432" w:type="dxa"/>
           </w:tcPr>
           <w:p>
             <w:pPr>
@@ -71,7 +80,7 @@
         </w:tc>
         <w:tc>
           <w:tcPr>
-            <w:tcW w:w="7137" w:type="dxa"/>
+            <w:tcW w:w="6922" w:type="dxa"/>
           </w:tcPr>
           <w:p>
             <w:pPr>
@@ -94,7 +103,7 @@
         </w:trPr>
         <w:tc>
           <w:tcPr>
-            <w:tcW w:w="2217" w:type="dxa"/>
+            <w:tcW w:w="2432" w:type="dxa"/>
           </w:tcPr>
           <w:p>
             <w:pPr>
@@ -112,7 +121,7 @@
         </w:tc>
         <w:tc>
           <w:tcPr>
-            <w:tcW w:w="7137" w:type="dxa"/>
+            <w:tcW w:w="6922" w:type="dxa"/>
           </w:tcPr>
           <w:p>
             <w:pPr>
@@ -122,6 +131,7 @@
             </w:pPr>
             <w:r>
               <w:rPr>
+                <w:i/>
                 <w:sz w:val="24"/>
               </w:rPr>
               <w:t>NotaCode</w:t>
@@ -135,12 +145,11 @@
         </w:trPr>
         <w:tc>
           <w:tcPr>
-            <w:tcW w:w="2217" w:type="dxa"/>
-          </w:tcPr>
-          <w:p>
-            <w:pPr>
-              <w:pStyle w:val="Compact"/>
-              <w:keepNext/>
+            <w:tcW w:w="2432" w:type="dxa"/>
+          </w:tcPr>
+          <w:p>
+            <w:pPr>
+              <w:pStyle w:val="Compact"/>
               <w:spacing w:before="0" w:after="0"/>
             </w:pPr>
             <w:r>
@@ -153,12 +162,11 @@
         </w:tc>
         <w:tc>
           <w:tcPr>
-            <w:tcW w:w="7137" w:type="dxa"/>
-          </w:tcPr>
-          <w:p>
-            <w:pPr>
-              <w:pStyle w:val="Compact"/>
-              <w:keepNext/>
+            <w:tcW w:w="6922" w:type="dxa"/>
+          </w:tcPr>
+          <w:p>
+            <w:pPr>
+              <w:pStyle w:val="Compact"/>
               <w:spacing w:before="0" w:after="0"/>
             </w:pPr>
             <w:r>
@@ -176,12 +184,11 @@
         </w:trPr>
         <w:tc>
           <w:tcPr>
-            <w:tcW w:w="2217" w:type="dxa"/>
-          </w:tcPr>
-          <w:p>
-            <w:pPr>
-              <w:pStyle w:val="Compact"/>
-              <w:keepNext/>
+            <w:tcW w:w="2432" w:type="dxa"/>
+          </w:tcPr>
+          <w:p>
+            <w:pPr>
+              <w:pStyle w:val="Compact"/>
               <w:spacing w:before="0" w:after="0"/>
             </w:pPr>
             <w:r>
@@ -194,19 +201,31 @@
         </w:tc>
         <w:tc>
           <w:tcPr>
-            <w:tcW w:w="7137" w:type="dxa"/>
-          </w:tcPr>
-          <w:p>
-            <w:pPr>
-              <w:pStyle w:val="Compact"/>
-              <w:keepNext/>
-              <w:spacing w:before="0" w:after="0"/>
-            </w:pPr>
-            <w:r>
-              <w:rPr>
-                <w:sz w:val="24"/>
-              </w:rPr>
-              <w:t>Проект создает веб-IDE «диаграммы как код» для студентов технических специальностей и аналитиков ПО, чтобы решить проблему отсутствия единого инструмента для всех нотаций проекта за счет единого редактора с текстовым вводом.</w:t>
+            <w:tcW w:w="6922" w:type="dxa"/>
+          </w:tcPr>
+          <w:p>
+            <w:pPr>
+              <w:pStyle w:val="Compact"/>
+              <w:spacing w:before="0" w:after="0"/>
+            </w:pPr>
+            <w:r>
+              <w:rPr>
+                <w:sz w:val="24"/>
+              </w:rPr>
+              <w:t>Проект создает веб-</w:t>
+            </w:r>
+            <w:r>
+              <w:rPr>
+                <w:i/>
+                <w:sz w:val="24"/>
+              </w:rPr>
+              <w:t>IDE</w:t>
+            </w:r>
+            <w:r>
+              <w:rPr>
+                <w:sz w:val="24"/>
+              </w:rPr>
+              <w:t xml:space="preserve"> «диаграммы как код» для студентов технических специальностей и аналитиков ПО, чтобы решить проблему отсутствия единого инструмента для всех нотаций проекта за счет единого редактора с текстовым вводом.</w:t>
             </w:r>
           </w:p>
         </w:tc>
@@ -217,12 +236,11 @@
         </w:trPr>
         <w:tc>
           <w:tcPr>
-            <w:tcW w:w="2217" w:type="dxa"/>
-          </w:tcPr>
-          <w:p>
-            <w:pPr>
-              <w:pStyle w:val="Compact"/>
-              <w:keepNext/>
+            <w:tcW w:w="2432" w:type="dxa"/>
+          </w:tcPr>
+          <w:p>
+            <w:pPr>
+              <w:pStyle w:val="Compact"/>
               <w:spacing w:before="0" w:after="0"/>
             </w:pPr>
             <w:r>
@@ -235,12 +253,11 @@
         </w:tc>
         <w:tc>
           <w:tcPr>
-            <w:tcW w:w="7137" w:type="dxa"/>
-          </w:tcPr>
-          <w:p>
-            <w:pPr>
-              <w:pStyle w:val="Compact"/>
-              <w:keepNext/>
+            <w:tcW w:w="6922" w:type="dxa"/>
+          </w:tcPr>
+          <w:p>
+            <w:pPr>
+              <w:pStyle w:val="Compact"/>
               <w:spacing w:before="0" w:after="0"/>
             </w:pPr>
             <w:r>
@@ -258,7 +275,7 @@
         </w:trPr>
         <w:tc>
           <w:tcPr>
-            <w:tcW w:w="2217" w:type="dxa"/>
+            <w:tcW w:w="2432" w:type="dxa"/>
           </w:tcPr>
           <w:p>
             <w:pPr>
@@ -275,18 +292,57 @@
         </w:tc>
         <w:tc>
           <w:tcPr>
-            <w:tcW w:w="7137" w:type="dxa"/>
-          </w:tcPr>
-          <w:p>
-            <w:pPr>
-              <w:pStyle w:val="Compact"/>
-              <w:spacing w:before="0" w:after="0"/>
-            </w:pPr>
-            <w:r>
-              <w:rPr>
-                <w:sz w:val="24"/>
-              </w:rPr>
-              <w:t>Республика Беларусь; студенты вузов; поиск и вузы как каналы; Free и Pro 40 USD в год</w:t>
+            <w:tcW w:w="6922" w:type="dxa"/>
+          </w:tcPr>
+          <w:p>
+            <w:pPr>
+              <w:pStyle w:val="Compact"/>
+              <w:spacing w:before="0" w:after="0"/>
+            </w:pPr>
+            <w:r>
+              <w:rPr>
+                <w:sz w:val="24"/>
+              </w:rPr>
+              <w:t xml:space="preserve">Республика Беларусь; студенты вузов; поиск и вузы как каналы; </w:t>
+            </w:r>
+            <w:r>
+              <w:rPr>
+                <w:i/>
+                <w:sz w:val="24"/>
+              </w:rPr>
+              <w:t>Free</w:t>
+            </w:r>
+            <w:r>
+              <w:rPr>
+                <w:sz w:val="24"/>
+              </w:rPr>
+              <w:t xml:space="preserve"> и </w:t>
+            </w:r>
+            <w:r>
+              <w:rPr>
+                <w:i/>
+                <w:sz w:val="24"/>
+              </w:rPr>
+              <w:t>Pro</w:t>
+            </w:r>
+            <w:r>
+              <w:rPr>
+                <w:sz w:val="24"/>
+              </w:rPr>
+              <w:t xml:space="preserve"> 40 </w:t>
+            </w:r>
+            <w:r>
+              <w:rPr>
+                <w:i/>
+                <w:sz w:val="24"/>
+              </w:rPr>
+              <w:t>USD</w:t>
+            </w:r>
+            <w:r>
+              <w:rPr>
+                <w:sz w:val="24"/>
+              </w:rPr>
+              <w:t xml:space="preserve"> в год</w:t>
             </w:r>
           </w:p>
         </w:tc>
@@ -317,9 +373,9 @@
         <w:tblLook w:val="0020" w:firstRow="1" w:lastRow="0" w:firstColumn="0" w:lastColumn="0" w:noHBand="0" w:noVBand="0"/>
       </w:tblPr>
       <w:tblGrid>
-        <w:gridCol w:w="1556"/>
-        <w:gridCol w:w="5872"/>
-        <w:gridCol w:w="1927"/>
+        <w:gridCol w:w="1646"/>
+        <w:gridCol w:w="5674"/>
+        <w:gridCol w:w="2035"/>
       </w:tblGrid>
       <w:tr>
         <w:trPr>
@@ -329,7 +385,7 @@
         </w:trPr>
         <w:tc>
           <w:tcPr>
-            <w:tcW w:w="1556" w:type="dxa"/>
+            <w:tcW w:w="1646" w:type="dxa"/>
           </w:tcPr>
           <w:p>
             <w:pPr>
@@ -347,7 +403,7 @@
         </w:tc>
         <w:tc>
           <w:tcPr>
-            <w:tcW w:w="5871" w:type="dxa"/>
+            <w:tcW w:w="5674" w:type="dxa"/>
           </w:tcPr>
           <w:p>
             <w:pPr>
@@ -365,7 +421,7 @@
         </w:tc>
         <w:tc>
           <w:tcPr>
-            <w:tcW w:w="1927" w:type="dxa"/>
+            <w:tcW w:w="2035" w:type="dxa"/>
           </w:tcPr>
           <w:p>
             <w:pPr>
@@ -388,7 +444,7 @@
         </w:trPr>
         <w:tc>
           <w:tcPr>
-            <w:tcW w:w="1556" w:type="dxa"/>
+            <w:tcW w:w="1646" w:type="dxa"/>
           </w:tcPr>
           <w:p>
             <w:pPr>
@@ -406,7 +462,7 @@
         </w:tc>
         <w:tc>
           <w:tcPr>
-            <w:tcW w:w="5871" w:type="dxa"/>
+            <w:tcW w:w="5674" w:type="dxa"/>
           </w:tcPr>
           <w:p>
             <w:pPr>
@@ -418,13 +474,85 @@
               <w:rPr>
                 <w:sz w:val="24"/>
               </w:rPr>
-              <w:t>Диаграммы IDEF0, DFD, сетей Петри не поддерживаются 8 просмотренными конкурентами; UML, BPMN и ERD вместе есть только у платного Lucidchart</w:t>
-            </w:r>
-          </w:p>
-        </w:tc>
-        <w:tc>
-          <w:tcPr>
-            <w:tcW w:w="1927" w:type="dxa"/>
+              <w:t xml:space="preserve">Диаграммы </w:t>
+            </w:r>
+            <w:r>
+              <w:rPr>
+                <w:i/>
+                <w:sz w:val="24"/>
+              </w:rPr>
+              <w:t>IDEF0</w:t>
+            </w:r>
+            <w:r>
+              <w:rPr>
+                <w:sz w:val="24"/>
+              </w:rPr>
+              <w:t xml:space="preserve">, </w:t>
+            </w:r>
+            <w:r>
+              <w:rPr>
+                <w:i/>
+                <w:sz w:val="24"/>
+              </w:rPr>
+              <w:t>DFD</w:t>
+            </w:r>
+            <w:r>
+              <w:rPr>
+                <w:sz w:val="24"/>
+              </w:rPr>
+              <w:t xml:space="preserve">, сетей Петри не поддерживаются 8 просмотренными конкурентами; </w:t>
+            </w:r>
+            <w:r>
+              <w:rPr>
+                <w:i/>
+                <w:sz w:val="24"/>
+              </w:rPr>
+              <w:t>UML</w:t>
+            </w:r>
+            <w:r>
+              <w:rPr>
+                <w:sz w:val="24"/>
+              </w:rPr>
+              <w:t xml:space="preserve">, </w:t>
+            </w:r>
+            <w:r>
+              <w:rPr>
+                <w:i/>
+                <w:sz w:val="24"/>
+              </w:rPr>
+              <w:t>BPMN</w:t>
+            </w:r>
+            <w:r>
+              <w:rPr>
+                <w:sz w:val="24"/>
+              </w:rPr>
+              <w:t xml:space="preserve"> и </w:t>
+            </w:r>
+            <w:r>
+              <w:rPr>
+                <w:i/>
+                <w:sz w:val="24"/>
+              </w:rPr>
+              <w:t>ERD</w:t>
+            </w:r>
+            <w:r>
+              <w:rPr>
+                <w:sz w:val="24"/>
+              </w:rPr>
+              <w:t xml:space="preserve"> вместе есть только у платного </w:t>
+            </w:r>
+            <w:r>
+              <w:rPr>
+                <w:i/>
+                <w:sz w:val="24"/>
+              </w:rPr>
+              <w:t>Lucidchart</w:t>
+            </w:r>
+          </w:p>
+        </w:tc>
+        <w:tc>
+          <w:tcPr>
+            <w:tcW w:w="2035" w:type="dxa"/>
           </w:tcPr>
           <w:p>
             <w:pPr>
@@ -447,12 +575,11 @@
         </w:trPr>
         <w:tc>
           <w:tcPr>
-            <w:tcW w:w="1556" w:type="dxa"/>
-          </w:tcPr>
-          <w:p>
-            <w:pPr>
-              <w:pStyle w:val="Compact"/>
-              <w:keepNext/>
+            <w:tcW w:w="1646" w:type="dxa"/>
+          </w:tcPr>
+          <w:p>
+            <w:pPr>
+              <w:pStyle w:val="Compact"/>
               <w:spacing w:before="0" w:after="0"/>
             </w:pPr>
             <w:r>
@@ -465,37 +592,62 @@
         </w:tc>
         <w:tc>
           <w:tcPr>
-            <w:tcW w:w="5871" w:type="dxa"/>
-          </w:tcPr>
-          <w:p>
-            <w:pPr>
-              <w:pStyle w:val="Compact"/>
-              <w:keepNext/>
-              <w:spacing w:before="0" w:after="0"/>
-            </w:pPr>
-            <w:r>
-              <w:rPr>
-                <w:sz w:val="24"/>
-              </w:rPr>
-              <w:t>UML – 591, BPMN – 476 запросов в месяц; спрос сезонный, снижается на 43–47 % за два года, 73–77 % – Минск и область</w:t>
-            </w:r>
-          </w:p>
-        </w:tc>
-        <w:tc>
-          <w:tcPr>
-            <w:tcW w:w="1927" w:type="dxa"/>
-          </w:tcPr>
-          <w:p>
-            <w:pPr>
-              <w:pStyle w:val="Compact"/>
-              <w:keepNext/>
-              <w:spacing w:before="0" w:after="0"/>
-            </w:pPr>
-            <w:r>
-              <w:rPr>
-                <w:sz w:val="24"/>
-              </w:rPr>
-              <w:t>ЛР1, Вордстат, Google Trends</w:t>
+            <w:tcW w:w="5674" w:type="dxa"/>
+          </w:tcPr>
+          <w:p>
+            <w:pPr>
+              <w:pStyle w:val="Compact"/>
+              <w:spacing w:before="0" w:after="0"/>
+            </w:pPr>
+            <w:r>
+              <w:rPr>
+                <w:i/>
+                <w:sz w:val="24"/>
+              </w:rPr>
+              <w:t>UML</w:t>
+            </w:r>
+            <w:r>
+              <w:rPr>
+                <w:sz w:val="24"/>
+              </w:rPr>
+              <w:t xml:space="preserve"> – 591, </w:t>
+            </w:r>
+            <w:r>
+              <w:rPr>
+                <w:i/>
+                <w:sz w:val="24"/>
+              </w:rPr>
+              <w:t>BPMN</w:t>
+            </w:r>
+            <w:r>
+              <w:rPr>
+                <w:sz w:val="24"/>
+              </w:rPr>
+              <w:t xml:space="preserve"> – 476 запросов в месяц; спрос сезонный, снижается на 43–47 % за два года, 73–77 % – Минск и область</w:t>
+            </w:r>
+          </w:p>
+        </w:tc>
+        <w:tc>
+          <w:tcPr>
+            <w:tcW w:w="2035" w:type="dxa"/>
+          </w:tcPr>
+          <w:p>
+            <w:pPr>
+              <w:pStyle w:val="Compact"/>
+              <w:spacing w:before="0" w:after="0"/>
+            </w:pPr>
+            <w:r>
+              <w:rPr>
+                <w:sz w:val="24"/>
+              </w:rPr>
+              <w:t xml:space="preserve">ЛР1, Вордстат, </w:t>
+            </w:r>
+            <w:r>
+              <w:rPr>
+                <w:i/>
+                <w:sz w:val="24"/>
+              </w:rPr>
+              <w:t>Google Trends</w:t>
             </w:r>
           </w:p>
         </w:tc>
@@ -506,12 +658,11 @@
         </w:trPr>
         <w:tc>
           <w:tcPr>
-            <w:tcW w:w="1556" w:type="dxa"/>
-          </w:tcPr>
-          <w:p>
-            <w:pPr>
-              <w:pStyle w:val="Compact"/>
-              <w:keepNext/>
+            <w:tcW w:w="1646" w:type="dxa"/>
+          </w:tcPr>
+          <w:p>
+            <w:pPr>
+              <w:pStyle w:val="Compact"/>
               <w:spacing w:before="0" w:after="0"/>
             </w:pPr>
             <w:r>
@@ -524,12 +675,11 @@
         </w:tc>
         <w:tc>
           <w:tcPr>
-            <w:tcW w:w="5871" w:type="dxa"/>
-          </w:tcPr>
-          <w:p>
-            <w:pPr>
-              <w:pStyle w:val="Compact"/>
-              <w:keepNext/>
+            <w:tcW w:w="5674" w:type="dxa"/>
+          </w:tcPr>
+          <w:p>
+            <w:pPr>
+              <w:pStyle w:val="Compact"/>
               <w:spacing w:before="0" w:after="0"/>
             </w:pPr>
             <w:r>
@@ -542,12 +692,11 @@
         </w:tc>
         <w:tc>
           <w:tcPr>
-            <w:tcW w:w="1927" w:type="dxa"/>
-          </w:tcPr>
-          <w:p>
-            <w:pPr>
-              <w:pStyle w:val="Compact"/>
-              <w:keepNext/>
+            <w:tcW w:w="2035" w:type="dxa"/>
+          </w:tcPr>
+          <w:p>
+            <w:pPr>
+              <w:pStyle w:val="Compact"/>
               <w:spacing w:before="0" w:after="0"/>
             </w:pPr>
             <w:r>
@@ -565,12 +714,11 @@
         </w:trPr>
         <w:tc>
           <w:tcPr>
-            <w:tcW w:w="1556" w:type="dxa"/>
-          </w:tcPr>
-          <w:p>
-            <w:pPr>
-              <w:pStyle w:val="Compact"/>
-              <w:keepNext/>
+            <w:tcW w:w="1646" w:type="dxa"/>
+          </w:tcPr>
+          <w:p>
+            <w:pPr>
+              <w:pStyle w:val="Compact"/>
               <w:spacing w:before="0" w:after="0"/>
             </w:pPr>
             <w:r>
@@ -583,30 +731,81 @@
         </w:tc>
         <w:tc>
           <w:tcPr>
-            <w:tcW w:w="5871" w:type="dxa"/>
-          </w:tcPr>
-          <w:p>
-            <w:pPr>
-              <w:pStyle w:val="Compact"/>
-              <w:keepNext/>
-              <w:spacing w:before="0" w:after="0"/>
-            </w:pPr>
-            <w:r>
-              <w:rPr>
-                <w:sz w:val="24"/>
-              </w:rPr>
-              <w:t>SAM 49 893–414 754 BYN в год; SOM 249–16 590 BYN; базовая оценка – около 33 платящих пользователей Pro</w:t>
-            </w:r>
-          </w:p>
-        </w:tc>
-        <w:tc>
-          <w:tcPr>
-            <w:tcW w:w="1927" w:type="dxa"/>
-          </w:tcPr>
-          <w:p>
-            <w:pPr>
-              <w:pStyle w:val="Compact"/>
-              <w:keepNext/>
+            <w:tcW w:w="5674" w:type="dxa"/>
+          </w:tcPr>
+          <w:p>
+            <w:pPr>
+              <w:pStyle w:val="Compact"/>
+              <w:spacing w:before="0" w:after="0"/>
+            </w:pPr>
+            <w:r>
+              <w:rPr>
+                <w:i/>
+                <w:sz w:val="24"/>
+              </w:rPr>
+              <w:t>SAM</w:t>
+            </w:r>
+            <w:r>
+              <w:rPr>
+                <w:sz w:val="24"/>
+              </w:rPr>
+              <w:t xml:space="preserve"> 49 893–414 754 </w:t>
+            </w:r>
+            <w:r>
+              <w:rPr>
+                <w:i/>
+                <w:sz w:val="24"/>
+              </w:rPr>
+              <w:t>BYN</w:t>
+            </w:r>
+            <w:r>
+              <w:rPr>
+                <w:sz w:val="24"/>
+              </w:rPr>
+              <w:t xml:space="preserve"> в год; </w:t>
+            </w:r>
+            <w:r>
+              <w:rPr>
+                <w:i/>
+                <w:sz w:val="24"/>
+              </w:rPr>
+              <w:t>SOM</w:t>
+            </w:r>
+            <w:r>
+              <w:rPr>
+                <w:sz w:val="24"/>
+              </w:rPr>
+              <w:t xml:space="preserve"> 249–16 590 </w:t>
+            </w:r>
+            <w:r>
+              <w:rPr>
+                <w:i/>
+                <w:sz w:val="24"/>
+              </w:rPr>
+              <w:t>BYN</w:t>
+            </w:r>
+            <w:r>
+              <w:rPr>
+                <w:sz w:val="24"/>
+              </w:rPr>
+              <w:t xml:space="preserve">; базовая оценка – около 33 платящих пользователей </w:t>
+            </w:r>
+            <w:r>
+              <w:rPr>
+                <w:i/>
+                <w:sz w:val="24"/>
+              </w:rPr>
+              <w:t>Pro</w:t>
+            </w:r>
+          </w:p>
+        </w:tc>
+        <w:tc>
+          <w:tcPr>
+            <w:tcW w:w="2035" w:type="dxa"/>
+          </w:tcPr>
+          <w:p>
+            <w:pPr>
+              <w:pStyle w:val="Compact"/>
               <w:spacing w:before="0" w:after="0"/>
             </w:pPr>
             <w:r>
@@ -624,7 +823,7 @@
         </w:trPr>
         <w:tc>
           <w:tcPr>
-            <w:tcW w:w="1556" w:type="dxa"/>
+            <w:tcW w:w="1646" w:type="dxa"/>
           </w:tcPr>
           <w:p>
             <w:pPr>
@@ -641,7 +840,7 @@
         </w:tc>
         <w:tc>
           <w:tcPr>
-            <w:tcW w:w="5871" w:type="dxa"/>
+            <w:tcW w:w="5674" w:type="dxa"/>
           </w:tcPr>
           <w:p>
             <w:pPr>
@@ -658,7 +857,7 @@
         </w:tc>
         <w:tc>
           <w:tcPr>
-            <w:tcW w:w="1927" w:type="dxa"/>
+            <w:tcW w:w="2035" w:type="dxa"/>
           </w:tcPr>
           <w:p>
             <w:pPr>
@@ -700,6 +899,7 @@
           <w:b/>
           <w:sz w:val="28"/>
         </w:rPr>
+        <w:lastRenderedPageBreak/>
         <w:t>3 Конкурентная среда и незакрытая проблема</w:t>
       </w:r>
     </w:p>
@@ -711,11 +911,43 @@
         <w:jc w:val="both"/>
       </w:pPr>
       <w:r>
-        <w:t xml:space="preserve">Уровень конкуренции: 1 прямой (PlantUML), 4 близких, 9 косвенных и заменителей, главный заменитель – бесплатный draw.io. Рыночный стандарт: </w:t>
-      </w:r>
-      <w:r>
-        <w:lastRenderedPageBreak/>
-        <w:t>бесплатный доступ, экспорт, интеграции, документация, открытая цена. Преимущество проекта: полный набор нотаций, включая IDEF0, DFD и сети Петри. Главная проблема клиента: клиент не может построить диаграмму всех нотаций проекта без нескольких инструментов и освоения синтаксиса.</w:t>
+        <w:t>Уровень конкуренции: 1 прямой (</w:t>
+      </w:r>
+      <w:r>
+        <w:rPr>
+          <w:i/>
+        </w:rPr>
+        <w:t>PlantUML</w:t>
+      </w:r>
+      <w:r>
+        <w:t xml:space="preserve">), 4 близких, 9 косвенных и заменителей, главный заменитель – бесплатный </w:t>
+      </w:r>
+      <w:r>
+        <w:rPr>
+          <w:i/>
+        </w:rPr>
+        <w:t>draw.io</w:t>
+      </w:r>
+      <w:r>
+        <w:t xml:space="preserve">. Рыночный стандарт: бесплатный доступ, экспорт, интеграции, документация, открытая цена. Преимущество проекта: полный набор нотаций, включая </w:t>
+      </w:r>
+      <w:r>
+        <w:rPr>
+          <w:i/>
+        </w:rPr>
+        <w:t>IDEF0</w:t>
+      </w:r>
+      <w:r>
+        <w:t xml:space="preserve">, </w:t>
+      </w:r>
+      <w:r>
+        <w:rPr>
+          <w:i/>
+        </w:rPr>
+        <w:t>DFD</w:t>
+      </w:r>
+      <w:r>
+        <w:t xml:space="preserve"> и сети Петри. Главная проблема клиента: клиент не может построить диаграмму всех нотаций проекта без нескольких инструментов и освоения синтаксиса.</w:t>
       </w:r>
     </w:p>
     <w:p>
@@ -743,8 +975,8 @@
         <w:tblLook w:val="0020" w:firstRow="1" w:lastRow="0" w:firstColumn="0" w:lastColumn="0" w:noHBand="0" w:noVBand="0"/>
       </w:tblPr>
       <w:tblGrid>
-        <w:gridCol w:w="1783"/>
-        <w:gridCol w:w="7572"/>
+        <w:gridCol w:w="1983"/>
+        <w:gridCol w:w="7372"/>
       </w:tblGrid>
       <w:tr>
         <w:trPr>
@@ -754,7 +986,7 @@
         </w:trPr>
         <w:tc>
           <w:tcPr>
-            <w:tcW w:w="1783" w:type="dxa"/>
+            <w:tcW w:w="1983" w:type="dxa"/>
           </w:tcPr>
           <w:p>
             <w:pPr>
@@ -772,7 +1004,7 @@
         </w:tc>
         <w:tc>
           <w:tcPr>
-            <w:tcW w:w="7571" w:type="dxa"/>
+            <w:tcW w:w="7371" w:type="dxa"/>
           </w:tcPr>
           <w:p>
             <w:pPr>
@@ -795,7 +1027,7 @@
         </w:trPr>
         <w:tc>
           <w:tcPr>
-            <w:tcW w:w="1783" w:type="dxa"/>
+            <w:tcW w:w="1983" w:type="dxa"/>
           </w:tcPr>
           <w:p>
             <w:pPr>
@@ -813,7 +1045,7 @@
         </w:tc>
         <w:tc>
           <w:tcPr>
-            <w:tcW w:w="7571" w:type="dxa"/>
+            <w:tcW w:w="7371" w:type="dxa"/>
           </w:tcPr>
           <w:p>
             <w:pPr>
@@ -825,7 +1057,33 @@
               <w:rPr>
                 <w:sz w:val="24"/>
               </w:rPr>
-              <w:t>Студенты технических специальностей (Free), аналитики и разработчики ПО (Pro)</w:t>
+              <w:t>Студенты технических специальностей (</w:t>
+            </w:r>
+            <w:r>
+              <w:rPr>
+                <w:i/>
+                <w:sz w:val="24"/>
+              </w:rPr>
+              <w:t>Free</w:t>
+            </w:r>
+            <w:r>
+              <w:rPr>
+                <w:sz w:val="24"/>
+              </w:rPr>
+              <w:t>), аналитики и разработчики ПО (</w:t>
+            </w:r>
+            <w:r>
+              <w:rPr>
+                <w:i/>
+                <w:sz w:val="24"/>
+              </w:rPr>
+              <w:t>Pro</w:t>
+            </w:r>
+            <w:r>
+              <w:rPr>
+                <w:sz w:val="24"/>
+              </w:rPr>
+              <w:t>)</w:t>
             </w:r>
           </w:p>
         </w:tc>
@@ -836,12 +1094,11 @@
         </w:trPr>
         <w:tc>
           <w:tcPr>
-            <w:tcW w:w="1783" w:type="dxa"/>
-          </w:tcPr>
-          <w:p>
-            <w:pPr>
-              <w:pStyle w:val="Compact"/>
-              <w:keepNext/>
+            <w:tcW w:w="1983" w:type="dxa"/>
+          </w:tcPr>
+          <w:p>
+            <w:pPr>
+              <w:pStyle w:val="Compact"/>
               <w:spacing w:before="0" w:after="0"/>
             </w:pPr>
             <w:r>
@@ -854,12 +1111,11 @@
         </w:tc>
         <w:tc>
           <w:tcPr>
-            <w:tcW w:w="7571" w:type="dxa"/>
-          </w:tcPr>
-          <w:p>
-            <w:pPr>
-              <w:pStyle w:val="Compact"/>
-              <w:keepNext/>
+            <w:tcW w:w="7371" w:type="dxa"/>
+          </w:tcPr>
+          <w:p>
+            <w:pPr>
+              <w:pStyle w:val="Compact"/>
               <w:spacing w:before="0" w:after="0"/>
             </w:pPr>
             <w:r>
@@ -877,12 +1133,11 @@
         </w:trPr>
         <w:tc>
           <w:tcPr>
-            <w:tcW w:w="1783" w:type="dxa"/>
-          </w:tcPr>
-          <w:p>
-            <w:pPr>
-              <w:pStyle w:val="Compact"/>
-              <w:keepNext/>
+            <w:tcW w:w="1983" w:type="dxa"/>
+          </w:tcPr>
+          <w:p>
+            <w:pPr>
+              <w:pStyle w:val="Compact"/>
               <w:spacing w:before="0" w:after="0"/>
             </w:pPr>
             <w:r>
@@ -895,19 +1150,64 @@
         </w:tc>
         <w:tc>
           <w:tcPr>
-            <w:tcW w:w="7571" w:type="dxa"/>
-          </w:tcPr>
-          <w:p>
-            <w:pPr>
-              <w:pStyle w:val="Compact"/>
-              <w:keepNext/>
-              <w:spacing w:before="0" w:after="0"/>
-            </w:pPr>
-            <w:r>
-              <w:rPr>
-                <w:sz w:val="24"/>
-              </w:rPr>
-              <w:t>Для студентов и аналитиков ПО, которые сталкиваются с несколькими инструментами для нотаций, проект предлагает единый редактор, позволяющий получить диаграмму любой нотации из текста лучше, чем draw.io и PlantUML, за счет набора нотаций, включая IDEF0 и DFD</w:t>
+            <w:tcW w:w="7371" w:type="dxa"/>
+          </w:tcPr>
+          <w:p>
+            <w:pPr>
+              <w:pStyle w:val="Compact"/>
+              <w:spacing w:before="0" w:after="0"/>
+            </w:pPr>
+            <w:r>
+              <w:rPr>
+                <w:sz w:val="24"/>
+              </w:rPr>
+              <w:t xml:space="preserve">Для студентов и аналитиков ПО, которые сталкиваются с несколькими инструментами для нотаций, проект предлагает единый редактор, позволяющий получить диаграмму любой нотации из текста лучше, чем </w:t>
+            </w:r>
+            <w:r>
+              <w:rPr>
+                <w:i/>
+                <w:sz w:val="24"/>
+              </w:rPr>
+              <w:t>draw.io</w:t>
+            </w:r>
+            <w:r>
+              <w:rPr>
+                <w:sz w:val="24"/>
+              </w:rPr>
+              <w:t xml:space="preserve"> и </w:t>
+            </w:r>
+            <w:r>
+              <w:rPr>
+                <w:i/>
+                <w:sz w:val="24"/>
+              </w:rPr>
+              <w:t>PlantUML</w:t>
+            </w:r>
+            <w:r>
+              <w:rPr>
+                <w:sz w:val="24"/>
+              </w:rPr>
+              <w:t xml:space="preserve">, за счет набора нотаций, включая </w:t>
+            </w:r>
+            <w:r>
+              <w:rPr>
+                <w:i/>
+                <w:sz w:val="24"/>
+              </w:rPr>
+              <w:t>IDEF0</w:t>
+            </w:r>
+            <w:r>
+              <w:rPr>
+                <w:sz w:val="24"/>
+              </w:rPr>
+              <w:t xml:space="preserve"> и </w:t>
+            </w:r>
+            <w:r>
+              <w:rPr>
+                <w:i/>
+                <w:sz w:val="24"/>
+              </w:rPr>
+              <w:t>DFD</w:t>
             </w:r>
           </w:p>
         </w:tc>
@@ -918,12 +1218,11 @@
         </w:trPr>
         <w:tc>
           <w:tcPr>
-            <w:tcW w:w="1783" w:type="dxa"/>
-          </w:tcPr>
-          <w:p>
-            <w:pPr>
-              <w:pStyle w:val="Compact"/>
-              <w:keepNext/>
+            <w:tcW w:w="1983" w:type="dxa"/>
+          </w:tcPr>
+          <w:p>
+            <w:pPr>
+              <w:pStyle w:val="Compact"/>
               <w:spacing w:before="0" w:after="0"/>
             </w:pPr>
             <w:r>
@@ -936,19 +1235,31 @@
         </w:tc>
         <w:tc>
           <w:tcPr>
-            <w:tcW w:w="7571" w:type="dxa"/>
-          </w:tcPr>
-          <w:p>
-            <w:pPr>
-              <w:pStyle w:val="Compact"/>
-              <w:keepNext/>
-              <w:spacing w:before="0" w:after="0"/>
-            </w:pPr>
-            <w:r>
-              <w:rPr>
-                <w:sz w:val="24"/>
-              </w:rPr>
-              <w:t>Веб-платформа (PWA): редактор, предпросмотр, экспорт, ИИ-ассистент</w:t>
+            <w:tcW w:w="7371" w:type="dxa"/>
+          </w:tcPr>
+          <w:p>
+            <w:pPr>
+              <w:pStyle w:val="Compact"/>
+              <w:spacing w:before="0" w:after="0"/>
+            </w:pPr>
+            <w:r>
+              <w:rPr>
+                <w:sz w:val="24"/>
+              </w:rPr>
+              <w:t>Веб-платформа (</w:t>
+            </w:r>
+            <w:r>
+              <w:rPr>
+                <w:i/>
+                <w:sz w:val="24"/>
+              </w:rPr>
+              <w:t>PWA</w:t>
+            </w:r>
+            <w:r>
+              <w:rPr>
+                <w:sz w:val="24"/>
+              </w:rPr>
+              <w:t>): редактор, предпросмотр, экспорт, ИИ-ассистент</w:t>
             </w:r>
           </w:p>
         </w:tc>
@@ -959,12 +1270,11 @@
         </w:trPr>
         <w:tc>
           <w:tcPr>
-            <w:tcW w:w="1783" w:type="dxa"/>
-          </w:tcPr>
-          <w:p>
-            <w:pPr>
-              <w:pStyle w:val="Compact"/>
-              <w:keepNext/>
+            <w:tcW w:w="1983" w:type="dxa"/>
+          </w:tcPr>
+          <w:p>
+            <w:pPr>
+              <w:pStyle w:val="Compact"/>
               <w:spacing w:before="0" w:after="0"/>
             </w:pPr>
             <w:r>
@@ -977,19 +1287,57 @@
         </w:tc>
         <w:tc>
           <w:tcPr>
-            <w:tcW w:w="7571" w:type="dxa"/>
-          </w:tcPr>
-          <w:p>
-            <w:pPr>
-              <w:pStyle w:val="Compact"/>
-              <w:keepNext/>
-              <w:spacing w:before="0" w:after="0"/>
-            </w:pPr>
-            <w:r>
-              <w:rPr>
-                <w:sz w:val="24"/>
-              </w:rPr>
-              <w:t>Пользователь Pro, подписка 40 USD в год (48 USD при 4 × 12)</w:t>
+            <w:tcW w:w="7371" w:type="dxa"/>
+          </w:tcPr>
+          <w:p>
+            <w:pPr>
+              <w:pStyle w:val="Compact"/>
+              <w:spacing w:before="0" w:after="0"/>
+            </w:pPr>
+            <w:r>
+              <w:rPr>
+                <w:sz w:val="24"/>
+              </w:rPr>
+              <w:t xml:space="preserve">Пользователь </w:t>
+            </w:r>
+            <w:r>
+              <w:rPr>
+                <w:i/>
+                <w:sz w:val="24"/>
+              </w:rPr>
+              <w:t>Pro</w:t>
+            </w:r>
+            <w:r>
+              <w:rPr>
+                <w:sz w:val="24"/>
+              </w:rPr>
+              <w:t xml:space="preserve">, подписка 40 </w:t>
+            </w:r>
+            <w:r>
+              <w:rPr>
+                <w:i/>
+                <w:sz w:val="24"/>
+              </w:rPr>
+              <w:t>USD</w:t>
+            </w:r>
+            <w:r>
+              <w:rPr>
+                <w:sz w:val="24"/>
+              </w:rPr>
+              <w:t xml:space="preserve"> в год (48 </w:t>
+            </w:r>
+            <w:r>
+              <w:rPr>
+                <w:i/>
+                <w:sz w:val="24"/>
+              </w:rPr>
+              <w:t>USD</w:t>
+            </w:r>
+            <w:r>
+              <w:rPr>
+                <w:sz w:val="24"/>
+              </w:rPr>
+              <w:t xml:space="preserve"> при 4 × 12)</w:t>
             </w:r>
           </w:p>
         </w:tc>
@@ -1000,7 +1348,7 @@
         </w:trPr>
         <w:tc>
           <w:tcPr>
-            <w:tcW w:w="1783" w:type="dxa"/>
+            <w:tcW w:w="1983" w:type="dxa"/>
           </w:tcPr>
           <w:p>
             <w:pPr>
@@ -1017,7 +1365,7 @@
         </w:tc>
         <w:tc>
           <w:tcPr>
-            <w:tcW w:w="7571" w:type="dxa"/>
+            <w:tcW w:w="7371" w:type="dxa"/>
           </w:tcPr>
           <w:p>
             <w:pPr>
@@ -1059,7 +1407,34 @@
         <w:jc w:val="both"/>
       </w:pPr>
       <w:r>
-        <w:t>Сегменты: студенты (Free), аналитики и разработчики (Pro). Ценность: диаграмма любой нотации из текста в одном инструменте. Каналы: поиск, сайт, вузы. Отношения: самообслуживание, документация. Доходы = подписка Pro × пользователь × год. Ресурсы и процессы: движок нотаций, разработка, документация. Партнеры и затраты: вузы, платежный и ИИ-провайдеры; разработка, облако, ИИ-вызовы. Итог этапа: ЦП, товар, монетизация, канал и первый релиз описывают одну задачу – построение диаграмм нотаций проекта; полнота Канваса 71 %.</w:t>
+        <w:t>Сегменты: студенты (</w:t>
+      </w:r>
+      <w:r>
+        <w:rPr>
+          <w:i/>
+        </w:rPr>
+        <w:t>Free</w:t>
+      </w:r>
+      <w:r>
+        <w:t>), аналитики и разработчики (</w:t>
+      </w:r>
+      <w:r>
+        <w:rPr>
+          <w:i/>
+        </w:rPr>
+        <w:t>Pro</w:t>
+      </w:r>
+      <w:r>
+        <w:t xml:space="preserve">). Ценность: диаграмма любой нотации из текста в одном инструменте. Каналы: поиск, сайт, вузы. Отношения: самообслуживание, документация. Доходы = подписка </w:t>
+      </w:r>
+      <w:r>
+        <w:rPr>
+          <w:i/>
+        </w:rPr>
+        <w:t>Pro</w:t>
+      </w:r>
+      <w:r>
+        <w:t xml:space="preserve"> × пользователь × год. Ресурсы и процессы: движок нотаций, разработка, документация. Партнеры и затраты: вузы, платежный и ИИ-провайдеры; разработка, облако, ИИ-вызовы. Итог этапа: ЦП, товар, монетизация, канал и первый релиз описывают одну задачу – построение диаграмм нотаций проекта; полнота Канваса 71 %.</w:t>
       </w:r>
     </w:p>
     <w:p>
@@ -1088,9 +1463,9 @@
         <w:tblLook w:val="0020" w:firstRow="1" w:lastRow="0" w:firstColumn="0" w:lastColumn="0" w:noHBand="0" w:noVBand="0"/>
       </w:tblPr>
       <w:tblGrid>
-        <w:gridCol w:w="1620"/>
-        <w:gridCol w:w="4645"/>
-        <w:gridCol w:w="3090"/>
+        <w:gridCol w:w="1792"/>
+        <w:gridCol w:w="4455"/>
+        <w:gridCol w:w="3108"/>
       </w:tblGrid>
       <w:tr>
         <w:trPr>
@@ -1100,7 +1475,7 @@
         </w:trPr>
         <w:tc>
           <w:tcPr>
-            <w:tcW w:w="1619" w:type="dxa"/>
+            <w:tcW w:w="1791" w:type="dxa"/>
           </w:tcPr>
           <w:p>
             <w:pPr>
@@ -1118,7 +1493,7 @@
         </w:tc>
         <w:tc>
           <w:tcPr>
-            <w:tcW w:w="4645" w:type="dxa"/>
+            <w:tcW w:w="4455" w:type="dxa"/>
           </w:tcPr>
           <w:p>
             <w:pPr>
@@ -1136,7 +1511,7 @@
         </w:tc>
         <w:tc>
           <w:tcPr>
-            <w:tcW w:w="3090" w:type="dxa"/>
+            <w:tcW w:w="3108" w:type="dxa"/>
           </w:tcPr>
           <w:p>
             <w:pPr>
@@ -1159,7 +1534,7 @@
         </w:trPr>
         <w:tc>
           <w:tcPr>
-            <w:tcW w:w="1619" w:type="dxa"/>
+            <w:tcW w:w="1791" w:type="dxa"/>
           </w:tcPr>
           <w:p>
             <w:pPr>
@@ -1177,7 +1552,7 @@
         </w:tc>
         <w:tc>
           <w:tcPr>
-            <w:tcW w:w="4645" w:type="dxa"/>
+            <w:tcW w:w="4455" w:type="dxa"/>
           </w:tcPr>
           <w:p>
             <w:pPr>
@@ -1189,13 +1564,130 @@
               <w:rPr>
                 <w:sz w:val="24"/>
               </w:rPr>
-              <w:t>Текстовый ввод с предпросмотром, нотации волны 1 (UML, ERD, IDEF0, IDEF1X, IDEF3, DFD), экспорт SVG и PNG, регистрация, тарифы, оплата или заявка Pro, заглушка ИИ-ассистента</w:t>
-            </w:r>
-          </w:p>
-        </w:tc>
-        <w:tc>
-          <w:tcPr>
-            <w:tcW w:w="3090" w:type="dxa"/>
+              <w:t>Текстовый ввод с предпросмотром, нотации волны 1 (</w:t>
+            </w:r>
+            <w:r>
+              <w:rPr>
+                <w:i/>
+                <w:sz w:val="24"/>
+              </w:rPr>
+              <w:t>UML</w:t>
+            </w:r>
+            <w:r>
+              <w:rPr>
+                <w:sz w:val="24"/>
+              </w:rPr>
+              <w:t xml:space="preserve">, </w:t>
+            </w:r>
+            <w:r>
+              <w:rPr>
+                <w:i/>
+                <w:sz w:val="24"/>
+              </w:rPr>
+              <w:t>ERD</w:t>
+            </w:r>
+            <w:r>
+              <w:rPr>
+                <w:sz w:val="24"/>
+              </w:rPr>
+              <w:t xml:space="preserve">, </w:t>
+            </w:r>
+            <w:r>
+              <w:rPr>
+                <w:i/>
+                <w:sz w:val="24"/>
+              </w:rPr>
+              <w:t>IDEF0</w:t>
+            </w:r>
+            <w:r>
+              <w:rPr>
+                <w:sz w:val="24"/>
+              </w:rPr>
+              <w:t xml:space="preserve">, </w:t>
+            </w:r>
+            <w:r>
+              <w:rPr>
+                <w:i/>
+                <w:sz w:val="24"/>
+              </w:rPr>
+              <w:t>IDEF1X</w:t>
+            </w:r>
+            <w:r>
+              <w:rPr>
+                <w:sz w:val="24"/>
+              </w:rPr>
+              <w:t xml:space="preserve">, </w:t>
+            </w:r>
+            <w:r>
+              <w:rPr>
+                <w:i/>
+                <w:sz w:val="24"/>
+              </w:rPr>
+              <w:t>IDEF3</w:t>
+            </w:r>
+            <w:r>
+              <w:rPr>
+                <w:sz w:val="24"/>
+              </w:rPr>
+              <w:t xml:space="preserve">, </w:t>
+            </w:r>
+            <w:r>
+              <w:rPr>
+                <w:i/>
+                <w:sz w:val="24"/>
+              </w:rPr>
+              <w:t>DFD</w:t>
+            </w:r>
+            <w:r>
+              <w:rPr>
+                <w:sz w:val="24"/>
+              </w:rPr>
+              <w:t xml:space="preserve">), экспорт </w:t>
+            </w:r>
+            <w:r>
+              <w:rPr>
+                <w:i/>
+                <w:sz w:val="24"/>
+              </w:rPr>
+              <w:t>SVG</w:t>
+            </w:r>
+            <w:r>
+              <w:rPr>
+                <w:sz w:val="24"/>
+              </w:rPr>
+              <w:t xml:space="preserve"> и </w:t>
+            </w:r>
+            <w:r>
+              <w:rPr>
+                <w:i/>
+                <w:sz w:val="24"/>
+              </w:rPr>
+              <w:t>PNG</w:t>
+            </w:r>
+            <w:r>
+              <w:rPr>
+                <w:sz w:val="24"/>
+              </w:rPr>
+              <w:t xml:space="preserve">, регистрация, тарифы, оплата или заявка </w:t>
+            </w:r>
+            <w:r>
+              <w:rPr>
+                <w:i/>
+                <w:sz w:val="24"/>
+              </w:rPr>
+              <w:t>Pro</w:t>
+            </w:r>
+            <w:r>
+              <w:rPr>
+                <w:sz w:val="24"/>
+              </w:rPr>
+              <w:t>, заглушка ИИ-ассистента</w:t>
+            </w:r>
+          </w:p>
+        </w:tc>
+        <w:tc>
+          <w:tcPr>
+            <w:tcW w:w="3108" w:type="dxa"/>
           </w:tcPr>
           <w:p>
             <w:pPr>
@@ -1205,9 +1697,23 @@
             </w:pPr>
             <w:r>
               <w:rPr>
-                <w:sz w:val="24"/>
-              </w:rPr>
-              <w:t>BPMN 2.0, сети Петри, ИИ-ассистент с квотами, подсказки об ошибках, совместная работа, API</w:t>
+                <w:i/>
+                <w:sz w:val="24"/>
+              </w:rPr>
+              <w:t>BPMN</w:t>
+            </w:r>
+            <w:r>
+              <w:rPr>
+                <w:sz w:val="24"/>
+              </w:rPr>
+              <w:t xml:space="preserve"> 2.0, сети Петри, ИИ-ассистент с квотами, подсказки об ошибках, совместная работа, </w:t>
+            </w:r>
+            <w:r>
+              <w:rPr>
+                <w:i/>
+                <w:sz w:val="24"/>
+              </w:rPr>
+              <w:t>API</w:t>
             </w:r>
           </w:p>
         </w:tc>
@@ -1218,12 +1724,11 @@
         </w:trPr>
         <w:tc>
           <w:tcPr>
-            <w:tcW w:w="1619" w:type="dxa"/>
-          </w:tcPr>
-          <w:p>
-            <w:pPr>
-              <w:pStyle w:val="Compact"/>
-              <w:keepNext/>
+            <w:tcW w:w="1791" w:type="dxa"/>
+          </w:tcPr>
+          <w:p>
+            <w:pPr>
+              <w:pStyle w:val="Compact"/>
               <w:spacing w:before="0" w:after="0"/>
             </w:pPr>
             <w:r>
@@ -1236,12 +1741,11 @@
         </w:tc>
         <w:tc>
           <w:tcPr>
-            <w:tcW w:w="4645" w:type="dxa"/>
-          </w:tcPr>
-          <w:p>
-            <w:pPr>
-              <w:pStyle w:val="Compact"/>
-              <w:keepNext/>
+            <w:tcW w:w="4455" w:type="dxa"/>
+          </w:tcPr>
+          <w:p>
+            <w:pPr>
+              <w:pStyle w:val="Compact"/>
               <w:spacing w:before="0" w:after="0"/>
             </w:pPr>
             <w:r>
@@ -1254,12 +1758,11 @@
         </w:tc>
         <w:tc>
           <w:tcPr>
-            <w:tcW w:w="3090" w:type="dxa"/>
-          </w:tcPr>
-          <w:p>
-            <w:pPr>
-              <w:pStyle w:val="Compact"/>
-              <w:keepNext/>
+            <w:tcW w:w="3108" w:type="dxa"/>
+          </w:tcPr>
+          <w:p>
+            <w:pPr>
+              <w:pStyle w:val="Compact"/>
               <w:spacing w:before="0" w:after="0"/>
             </w:pPr>
             <w:r>
@@ -1277,12 +1780,11 @@
         </w:trPr>
         <w:tc>
           <w:tcPr>
-            <w:tcW w:w="1619" w:type="dxa"/>
-          </w:tcPr>
-          <w:p>
-            <w:pPr>
-              <w:pStyle w:val="Compact"/>
-              <w:keepNext/>
+            <w:tcW w:w="1791" w:type="dxa"/>
+          </w:tcPr>
+          <w:p>
+            <w:pPr>
+              <w:pStyle w:val="Compact"/>
               <w:spacing w:before="0" w:after="0"/>
             </w:pPr>
             <w:r>
@@ -1295,12 +1797,11 @@
         </w:tc>
         <w:tc>
           <w:tcPr>
-            <w:tcW w:w="4645" w:type="dxa"/>
-          </w:tcPr>
-          <w:p>
-            <w:pPr>
-              <w:pStyle w:val="Compact"/>
-              <w:keepNext/>
+            <w:tcW w:w="4455" w:type="dxa"/>
+          </w:tcPr>
+          <w:p>
+            <w:pPr>
+              <w:pStyle w:val="Compact"/>
               <w:spacing w:before="0" w:after="0"/>
             </w:pPr>
             <w:r>
@@ -1313,12 +1814,11 @@
         </w:tc>
         <w:tc>
           <w:tcPr>
-            <w:tcW w:w="3090" w:type="dxa"/>
-          </w:tcPr>
-          <w:p>
-            <w:pPr>
-              <w:pStyle w:val="Compact"/>
-              <w:keepNext/>
+            <w:tcW w:w="3108" w:type="dxa"/>
+          </w:tcPr>
+          <w:p>
+            <w:pPr>
+              <w:pStyle w:val="Compact"/>
               <w:spacing w:before="0" w:after="0"/>
             </w:pPr>
             <w:r>
@@ -1336,12 +1836,11 @@
         </w:trPr>
         <w:tc>
           <w:tcPr>
-            <w:tcW w:w="1619" w:type="dxa"/>
-          </w:tcPr>
-          <w:p>
-            <w:pPr>
-              <w:pStyle w:val="Compact"/>
-              <w:keepNext/>
+            <w:tcW w:w="1791" w:type="dxa"/>
+          </w:tcPr>
+          <w:p>
+            <w:pPr>
+              <w:pStyle w:val="Compact"/>
               <w:spacing w:before="0" w:after="0"/>
             </w:pPr>
             <w:r>
@@ -1354,12 +1853,11 @@
         </w:tc>
         <w:tc>
           <w:tcPr>
-            <w:tcW w:w="4645" w:type="dxa"/>
-          </w:tcPr>
-          <w:p>
-            <w:pPr>
-              <w:pStyle w:val="Compact"/>
-              <w:keepNext/>
+            <w:tcW w:w="4455" w:type="dxa"/>
+          </w:tcPr>
+          <w:p>
+            <w:pPr>
+              <w:pStyle w:val="Compact"/>
               <w:spacing w:before="0" w:after="0"/>
             </w:pPr>
             <w:r>
@@ -1372,19 +1870,25 @@
         </w:tc>
         <w:tc>
           <w:tcPr>
-            <w:tcW w:w="3090" w:type="dxa"/>
-          </w:tcPr>
-          <w:p>
-            <w:pPr>
-              <w:pStyle w:val="Compact"/>
-              <w:keepNext/>
-              <w:spacing w:before="0" w:after="0"/>
-            </w:pPr>
-            <w:r>
-              <w:rPr>
-                <w:sz w:val="24"/>
-              </w:rPr>
-              <w:t>API, внешние сервисы</w:t>
+            <w:tcW w:w="3108" w:type="dxa"/>
+          </w:tcPr>
+          <w:p>
+            <w:pPr>
+              <w:pStyle w:val="Compact"/>
+              <w:spacing w:before="0" w:after="0"/>
+            </w:pPr>
+            <w:r>
+              <w:rPr>
+                <w:i/>
+                <w:sz w:val="24"/>
+              </w:rPr>
+              <w:t>API</w:t>
+            </w:r>
+            <w:r>
+              <w:rPr>
+                <w:sz w:val="24"/>
+              </w:rPr>
+              <w:t>, внешние сервисы</w:t>
             </w:r>
           </w:p>
         </w:tc>
@@ -1395,7 +1899,7 @@
         </w:trPr>
         <w:tc>
           <w:tcPr>
-            <w:tcW w:w="1619" w:type="dxa"/>
+            <w:tcW w:w="1791" w:type="dxa"/>
           </w:tcPr>
           <w:p>
             <w:pPr>
@@ -1412,7 +1916,7 @@
         </w:tc>
         <w:tc>
           <w:tcPr>
-            <w:tcW w:w="4645" w:type="dxa"/>
+            <w:tcW w:w="4455" w:type="dxa"/>
           </w:tcPr>
           <w:p>
             <w:pPr>
@@ -1429,7 +1933,7 @@
         </w:tc>
         <w:tc>
           <w:tcPr>
-            <w:tcW w:w="3090" w:type="dxa"/>
+            <w:tcW w:w="3108" w:type="dxa"/>
           </w:tcPr>
           <w:p>
             <w:pPr>
@@ -1471,9 +1975,9 @@
         <w:tblLook w:val="0020" w:firstRow="1" w:lastRow="0" w:firstColumn="0" w:lastColumn="0" w:noHBand="0" w:noVBand="0"/>
       </w:tblPr>
       <w:tblGrid>
-        <w:gridCol w:w="1349"/>
-        <w:gridCol w:w="5463"/>
-        <w:gridCol w:w="2543"/>
+        <w:gridCol w:w="1531"/>
+        <w:gridCol w:w="5241"/>
+        <w:gridCol w:w="2583"/>
       </w:tblGrid>
       <w:tr>
         <w:trPr>
@@ -1483,7 +1987,7 @@
         </w:trPr>
         <w:tc>
           <w:tcPr>
-            <w:tcW w:w="1349" w:type="dxa"/>
+            <w:tcW w:w="1531" w:type="dxa"/>
           </w:tcPr>
           <w:p>
             <w:pPr>
@@ -1501,7 +2005,7 @@
         </w:tc>
         <w:tc>
           <w:tcPr>
-            <w:tcW w:w="5462" w:type="dxa"/>
+            <w:tcW w:w="5241" w:type="dxa"/>
           </w:tcPr>
           <w:p>
             <w:pPr>
@@ -1519,7 +2023,7 @@
         </w:tc>
         <w:tc>
           <w:tcPr>
-            <w:tcW w:w="2543" w:type="dxa"/>
+            <w:tcW w:w="2583" w:type="dxa"/>
           </w:tcPr>
           <w:p>
             <w:pPr>
@@ -1542,7 +2046,7 @@
         </w:trPr>
         <w:tc>
           <w:tcPr>
-            <w:tcW w:w="1349" w:type="dxa"/>
+            <w:tcW w:w="1531" w:type="dxa"/>
           </w:tcPr>
           <w:p>
             <w:pPr>
@@ -1560,7 +2064,7 @@
         </w:tc>
         <w:tc>
           <w:tcPr>
-            <w:tcW w:w="5462" w:type="dxa"/>
+            <w:tcW w:w="5241" w:type="dxa"/>
           </w:tcPr>
           <w:p>
             <w:pPr>
@@ -1578,7 +2082,7 @@
         </w:tc>
         <w:tc>
           <w:tcPr>
-            <w:tcW w:w="2543" w:type="dxa"/>
+            <w:tcW w:w="2583" w:type="dxa"/>
           </w:tcPr>
           <w:p>
             <w:pPr>
@@ -1601,12 +2105,11 @@
         </w:trPr>
         <w:tc>
           <w:tcPr>
-            <w:tcW w:w="1349" w:type="dxa"/>
-          </w:tcPr>
-          <w:p>
-            <w:pPr>
-              <w:pStyle w:val="Compact"/>
-              <w:keepNext/>
+            <w:tcW w:w="1531" w:type="dxa"/>
+          </w:tcPr>
+          <w:p>
+            <w:pPr>
+              <w:pStyle w:val="Compact"/>
               <w:spacing w:before="0" w:after="0"/>
             </w:pPr>
             <w:r>
@@ -1619,30 +2122,61 @@
         </w:tc>
         <w:tc>
           <w:tcPr>
-            <w:tcW w:w="5462" w:type="dxa"/>
-          </w:tcPr>
-          <w:p>
-            <w:pPr>
-              <w:pStyle w:val="Compact"/>
-              <w:keepNext/>
-              <w:spacing w:before="0" w:after="0"/>
-            </w:pPr>
-            <w:r>
-              <w:rPr>
-                <w:sz w:val="24"/>
-              </w:rPr>
-              <w:t>Активация (первый Run в первый день); конверсия Free в Pro</w:t>
-            </w:r>
-          </w:p>
-        </w:tc>
-        <w:tc>
-          <w:tcPr>
-            <w:tcW w:w="2543" w:type="dxa"/>
-          </w:tcPr>
-          <w:p>
-            <w:pPr>
-              <w:pStyle w:val="Compact"/>
-              <w:keepNext/>
+            <w:tcW w:w="5241" w:type="dxa"/>
+          </w:tcPr>
+          <w:p>
+            <w:pPr>
+              <w:pStyle w:val="Compact"/>
+              <w:spacing w:before="0" w:after="0"/>
+            </w:pPr>
+            <w:r>
+              <w:rPr>
+                <w:sz w:val="24"/>
+              </w:rPr>
+              <w:t xml:space="preserve">Активация (первый </w:t>
+            </w:r>
+            <w:r>
+              <w:rPr>
+                <w:i/>
+                <w:sz w:val="24"/>
+              </w:rPr>
+              <w:t>Run</w:t>
+            </w:r>
+            <w:r>
+              <w:rPr>
+                <w:sz w:val="24"/>
+              </w:rPr>
+              <w:t xml:space="preserve"> в первый день); конверсия </w:t>
+            </w:r>
+            <w:r>
+              <w:rPr>
+                <w:i/>
+                <w:sz w:val="24"/>
+              </w:rPr>
+              <w:t>Free</w:t>
+            </w:r>
+            <w:r>
+              <w:rPr>
+                <w:sz w:val="24"/>
+              </w:rPr>
+              <w:t xml:space="preserve"> в </w:t>
+            </w:r>
+            <w:r>
+              <w:rPr>
+                <w:i/>
+                <w:sz w:val="24"/>
+              </w:rPr>
+              <w:t>Pro</w:t>
+            </w:r>
+          </w:p>
+        </w:tc>
+        <w:tc>
+          <w:tcPr>
+            <w:tcW w:w="2583" w:type="dxa"/>
+          </w:tcPr>
+          <w:p>
+            <w:pPr>
+              <w:pStyle w:val="Compact"/>
               <w:spacing w:before="0" w:after="0"/>
             </w:pPr>
             <w:r>
@@ -1660,12 +2194,11 @@
         </w:trPr>
         <w:tc>
           <w:tcPr>
-            <w:tcW w:w="1349" w:type="dxa"/>
-          </w:tcPr>
-          <w:p>
-            <w:pPr>
-              <w:pStyle w:val="Compact"/>
-              <w:keepNext/>
+            <w:tcW w:w="1531" w:type="dxa"/>
+          </w:tcPr>
+          <w:p>
+            <w:pPr>
+              <w:pStyle w:val="Compact"/>
               <w:spacing w:before="0" w:after="0"/>
             </w:pPr>
             <w:r>
@@ -1678,37 +2211,62 @@
         </w:tc>
         <w:tc>
           <w:tcPr>
-            <w:tcW w:w="5462" w:type="dxa"/>
-          </w:tcPr>
-          <w:p>
-            <w:pPr>
-              <w:pStyle w:val="Compact"/>
-              <w:keepNext/>
-              <w:spacing w:before="0" w:after="0"/>
-            </w:pPr>
-            <w:r>
-              <w:rPr>
-                <w:sz w:val="24"/>
-              </w:rPr>
-              <w:t>ARPPU в месяц; денежные расходы MVP</w:t>
-            </w:r>
-          </w:p>
-        </w:tc>
-        <w:tc>
-          <w:tcPr>
-            <w:tcW w:w="2543" w:type="dxa"/>
-          </w:tcPr>
-          <w:p>
-            <w:pPr>
-              <w:pStyle w:val="Compact"/>
-              <w:keepNext/>
-              <w:spacing w:before="0" w:after="0"/>
-            </w:pPr>
-            <w:r>
-              <w:rPr>
-                <w:sz w:val="24"/>
-              </w:rPr>
-              <w:t>4 USD; 0 (бесплатные тарифы)</w:t>
+            <w:tcW w:w="5241" w:type="dxa"/>
+          </w:tcPr>
+          <w:p>
+            <w:pPr>
+              <w:pStyle w:val="Compact"/>
+              <w:spacing w:before="0" w:after="0"/>
+            </w:pPr>
+            <w:r>
+              <w:rPr>
+                <w:i/>
+                <w:sz w:val="24"/>
+              </w:rPr>
+              <w:t>ARPPU</w:t>
+            </w:r>
+            <w:r>
+              <w:rPr>
+                <w:sz w:val="24"/>
+              </w:rPr>
+              <w:t xml:space="preserve"> в месяц; денежные расходы </w:t>
+            </w:r>
+            <w:r>
+              <w:rPr>
+                <w:i/>
+                <w:sz w:val="24"/>
+              </w:rPr>
+              <w:t>MVP</w:t>
+            </w:r>
+          </w:p>
+        </w:tc>
+        <w:tc>
+          <w:tcPr>
+            <w:tcW w:w="2583" w:type="dxa"/>
+          </w:tcPr>
+          <w:p>
+            <w:pPr>
+              <w:pStyle w:val="Compact"/>
+              <w:spacing w:before="0" w:after="0"/>
+            </w:pPr>
+            <w:r>
+              <w:rPr>
+                <w:sz w:val="24"/>
+              </w:rPr>
+              <w:t xml:space="preserve">4 </w:t>
+            </w:r>
+            <w:r>
+              <w:rPr>
+                <w:i/>
+                <w:sz w:val="24"/>
+              </w:rPr>
+              <w:t>USD</w:t>
+            </w:r>
+            <w:r>
+              <w:rPr>
+                <w:sz w:val="24"/>
+              </w:rPr>
+              <w:t>; 0 (бесплатные тарифы)</w:t>
             </w:r>
           </w:p>
         </w:tc>
@@ -1719,12 +2277,11 @@
         </w:trPr>
         <w:tc>
           <w:tcPr>
-            <w:tcW w:w="1349" w:type="dxa"/>
-          </w:tcPr>
-          <w:p>
-            <w:pPr>
-              <w:pStyle w:val="Compact"/>
-              <w:keepNext/>
+            <w:tcW w:w="1531" w:type="dxa"/>
+          </w:tcPr>
+          <w:p>
+            <w:pPr>
+              <w:pStyle w:val="Compact"/>
               <w:spacing w:before="0" w:after="0"/>
             </w:pPr>
             <w:r>
@@ -1737,30 +2294,35 @@
         </w:tc>
         <w:tc>
           <w:tcPr>
-            <w:tcW w:w="5462" w:type="dxa"/>
-          </w:tcPr>
-          <w:p>
-            <w:pPr>
-              <w:pStyle w:val="Compact"/>
-              <w:keepNext/>
-              <w:spacing w:before="0" w:after="0"/>
-            </w:pPr>
-            <w:r>
-              <w:rPr>
-                <w:sz w:val="24"/>
-              </w:rPr>
-              <w:t>Возврат на 7 и 30 день; отток Pro</w:t>
-            </w:r>
-          </w:p>
-        </w:tc>
-        <w:tc>
-          <w:tcPr>
-            <w:tcW w:w="2543" w:type="dxa"/>
-          </w:tcPr>
-          <w:p>
-            <w:pPr>
-              <w:pStyle w:val="Compact"/>
-              <w:keepNext/>
+            <w:tcW w:w="5241" w:type="dxa"/>
+          </w:tcPr>
+          <w:p>
+            <w:pPr>
+              <w:pStyle w:val="Compact"/>
+              <w:spacing w:before="0" w:after="0"/>
+            </w:pPr>
+            <w:r>
+              <w:rPr>
+                <w:sz w:val="24"/>
+              </w:rPr>
+              <w:t xml:space="preserve">Возврат на 7 и 30 день; отток </w:t>
+            </w:r>
+            <w:r>
+              <w:rPr>
+                <w:i/>
+                <w:sz w:val="24"/>
+              </w:rPr>
+              <w:t>Pro</w:t>
+            </w:r>
+          </w:p>
+        </w:tc>
+        <w:tc>
+          <w:tcPr>
+            <w:tcW w:w="2583" w:type="dxa"/>
+          </w:tcPr>
+          <w:p>
+            <w:pPr>
+              <w:pStyle w:val="Compact"/>
               <w:spacing w:before="0" w:after="0"/>
             </w:pPr>
             <w:r>
@@ -1778,7 +2340,7 @@
         </w:trPr>
         <w:tc>
           <w:tcPr>
-            <w:tcW w:w="1349" w:type="dxa"/>
+            <w:tcW w:w="1531" w:type="dxa"/>
           </w:tcPr>
           <w:p>
             <w:pPr>
@@ -1795,7 +2357,7 @@
         </w:tc>
         <w:tc>
           <w:tcPr>
-            <w:tcW w:w="5462" w:type="dxa"/>
+            <w:tcW w:w="5241" w:type="dxa"/>
           </w:tcPr>
           <w:p>
             <w:pPr>
@@ -1812,7 +2374,7 @@
         </w:tc>
         <w:tc>
           <w:tcPr>
-            <w:tcW w:w="2543" w:type="dxa"/>
+            <w:tcW w:w="2583" w:type="dxa"/>
           </w:tcPr>
           <w:p>
             <w:pPr>
@@ -1854,7 +2416,43 @@
         <w:jc w:val="both"/>
       </w:pPr>
       <w:r>
-        <w:t>Пилот: ограниченный запуск первого релиза для студентов вузов Беларуси, поскольку ЦП перспективно, но нужно проверить готовность платить и причину снижения спроса. Критерий продолжения: достигнуты пороги метрик (активация не менее 60 %, D7 30 %, конверсия в Pro 3 %) и подтверждена готовность платить за Pro. Объем пилота ограничен 610 ч работы и нулевым бюджетом инфраструктуры, срок MVP – до 06.12.2026.</w:t>
+        <w:t xml:space="preserve">Пилот: ограниченный запуск первого релиза для студентов вузов Беларуси, поскольку ЦП перспективно, но нужно проверить готовность платить и причину снижения спроса. Критерий продолжения: достигнуты пороги метрик (активация не менее 60 %, </w:t>
+      </w:r>
+      <w:r>
+        <w:rPr>
+          <w:i/>
+        </w:rPr>
+        <w:t>D7</w:t>
+      </w:r>
+      <w:r>
+        <w:t xml:space="preserve"> 30 %, конверсия в </w:t>
+      </w:r>
+      <w:r>
+        <w:rPr>
+          <w:i/>
+        </w:rPr>
+        <w:t>Pro</w:t>
+      </w:r>
+      <w:r>
+        <w:t xml:space="preserve"> 3 %) и подтверждена готовность платить за </w:t>
+      </w:r>
+      <w:r>
+        <w:rPr>
+          <w:i/>
+        </w:rPr>
+        <w:t>Pro</w:t>
+      </w:r>
+      <w:r>
+        <w:t xml:space="preserve">. Объем пилота ограничен 610 ч работы и нулевым бюджетом инфраструктуры, срок </w:t>
+      </w:r>
+      <w:r>
+        <w:rPr>
+          <w:i/>
+        </w:rPr>
+        <w:t>MVP</w:t>
+      </w:r>
+      <w:r>
+        <w:t xml:space="preserve"> – до 06.12.2026.</w:t>
       </w:r>
     </w:p>
     <w:p>
@@ -1871,6 +2469,7 @@
           <w:b/>
           <w:sz w:val="28"/>
         </w:rPr>
+        <w:lastRenderedPageBreak/>
         <w:t>9 Краткий вывод для резюме</w:t>
       </w:r>
     </w:p>
@@ -1882,16 +2481,23 @@
         <w:jc w:val="both"/>
       </w:pPr>
       <w:r>
-        <w:t xml:space="preserve">Проект NotaCode целесообразно рассматривать как веб-платформу «диаграммы как код» для студентов технических специальностей и аналитиков </w:t>
-      </w:r>
-      <w:r>
-        <w:lastRenderedPageBreak/>
-        <w:t>ПО. Его ценность основана на решении проблемы отсутствия единого набора нотаций, подтвержденной страницами восьми конкурентов. Первый релиз должен быть ограничен редактором нотаций волны 1, экспортом, тарифами, регистрацией и оплатой, которые сохраняют ключевое ценностное обещание и позволяют проверить спрос, оплату и удержание. Инвестиционное решение: пилот при условиях проверки готовности платить, выяснения причины снижения спроса и составления сметы.</w:t>
+        <w:t xml:space="preserve">Проект </w:t>
+      </w:r>
+      <w:r>
+        <w:rPr>
+          <w:i/>
+        </w:rPr>
+        <w:t>NotaCode</w:t>
+      </w:r>
+      <w:r>
+        <w:t xml:space="preserve"> целесообразно рассматривать как веб-платформу «диаграммы как код» для студентов технических специальностей и аналитиков ПО. Его ценность основана на решении проблемы отсутствия единого набора нотаций, подтвержденной страницами восьми конкурентов. Первый релиз должен быть ограничен редактором нотаций волны 1, экспортом, тарифами, регистрацией и оплатой, которые сохраняют ключевое ценностное обещание и позволяют проверить спрос, оплату и удержание. Инвестиционное решение: пилот при условиях проверки готовности платить, выяснения причины снижения спроса и составления сметы.</w:t>
       </w:r>
       <w:bookmarkEnd w:id="0"/>
       <w:bookmarkEnd w:id="9"/>
     </w:p>
     <w:sectPr>
+      <w:headerReference w:type="default" r:id="rId7"/>
+      <w:footerReference w:type="default" r:id="rId8"/>
       <w:footnotePr>
         <w:numRestart w:val="eachSect"/>
       </w:footnotePr>
@@ -1928,6 +2534,12 @@
 </w:endnotes>
 </file>
 
+<file path=word/footer1.xml><?xml version="1.0" encoding="utf-8"?>
+<w:ftr xmlns:wpc="http://schemas.microsoft.com/office/word/2010/wordprocessingCanvas" xmlns:cx="http://schemas.microsoft.com/office/drawing/2014/chartex" xmlns:cx1="http://schemas.microsoft.com/office/drawing/2015/9/8/chartex" xmlns:cx2="http://schemas.microsoft.com/office/drawing/2015/10/21/chartex" xmlns:cx3="http://schemas.microsoft.com/office/drawing/2016/5/9/chartex" xmlns:cx4="http://schemas.microsoft.com/office/drawing/2016/5/10/chartex" xmlns:cx5="http://schemas.microsoft.com/office/drawing/2016/5/11/chartex" xmlns:cx6="http://schemas.microsoft.com/office/drawing/2016/5/12/chartex" xmlns:cx7="http://schemas.microsoft.com/office/drawing/2016/5/13/chartex" xmlns:cx8="http://schemas.microsoft.com/office/drawing/2016/5/14/chartex" xmlns:mc="http://schemas.openxmlformats.org/markup-compatibility/2006" xmlns:aink="http://schemas.microsoft.com/office/drawing/2016/ink" xmlns:am3d="http://schemas.microsoft.com/office/drawing/2017/model3d" xmlns:o="urn:schemas-microsoft-com:office:office" xmlns:oel="http://schemas.microsoft.com/office/2019/extlst" xmlns:r="http://schemas.openxmlformats.org/officeDocument/2006/relationships" xmlns:m="http://schemas.openxmlformats.org/officeDocument/2006/math" xmlns:v="urn:schemas-microsoft-com:vml" xmlns:wp14="http://schemas.microsoft.com/office/word/2010/wordprocessingDrawing" xmlns:wp="http://schemas.openxmlformats.org/drawingml/2006/wordprocessingDrawing" xmlns:w10="urn:schemas-microsoft-com:office:word" xmlns:w="http://schemas.openxmlformats.org/wordprocessingml/2006/main" xmlns:w14="http://schemas.microsoft.com/office/word/2010/wordml" xmlns:w15="http://schemas.microsoft.com/office/word/2012/wordml" xmlns:w16cex="http://schemas.microsoft.com/office/word/2018/wordml/cex" xmlns:w16cid="http://schemas.microsoft.com/office/word/2016/wordml/cid" xmlns:w16="http://schemas.microsoft.com/office/word/2018/wordml" xmlns:w16du="http://schemas.microsoft.com/office/word/2023/wordml/word16du" xmlns:w16sdtdh="http://schemas.microsoft.com/office/word/2020/wordml/sdtdatahash" xmlns:w16sdtfl="http://schemas.microsoft.com/office/word/2024/wordml/sdtformatlock" xmlns:w16se="http://schemas.microsoft.com/office/word/2015/wordml/symex" xmlns:wpg="http://schemas.microsoft.com/office/word/2010/wordprocessingGroup" xmlns:wpi="http://schemas.microsoft.com/office/word/2010/wordprocessingInk" xmlns:wne="http://schemas.microsoft.com/office/word/2006/wordml" xmlns:wps="http://schemas.microsoft.com/office/word/2010/wordprocessingShape" mc:Ignorable="w14 w15 w16se w16cid w16 w16cex w16sdtdh w16sdtfl w16du wp14">
+  <w:p/>
+</w:ftr>
+</file>
+
 <file path=word/footnotes.xml><?xml version="1.0" encoding="utf-8"?>
 <w:footnotes xmlns:wpc="http://schemas.microsoft.com/office/word/2010/wordprocessingCanvas" xmlns:cx="http://schemas.microsoft.com/office/drawing/2014/chartex" xmlns:cx1="http://schemas.microsoft.com/office/drawing/2015/9/8/chartex" xmlns:cx2="http://schemas.microsoft.com/office/drawing/2015/10/21/chartex" xmlns:cx3="http://schemas.microsoft.com/office/drawing/2016/5/9/chartex" xmlns:cx4="http://schemas.microsoft.com/office/drawing/2016/5/10/chartex" xmlns:cx5="http://schemas.microsoft.com/office/drawing/2016/5/11/chartex" xmlns:cx6="http://schemas.microsoft.com/office/drawing/2016/5/12/chartex" xmlns:cx7="http://schemas.microsoft.com/office/drawing/2016/5/13/chartex" xmlns:cx8="http://schemas.microsoft.com/office/drawing/2016/5/14/chartex" xmlns:mc="http://schemas.openxmlformats.org/markup-compatibility/2006" xmlns:aink="http://schemas.microsoft.com/office/drawing/2016/ink" xmlns:am3d="http://schemas.microsoft.com/office/drawing/2017/model3d" xmlns:o="urn:schemas-microsoft-com:office:office" xmlns:oel="http://schemas.microsoft.com/office/2019/extlst" xmlns:r="http://schemas.openxmlformats.org/officeDocument/2006/relationships" xmlns:m="http://schemas.openxmlformats.org/officeDocument/2006/math" xmlns:v="urn:schemas-microsoft-com:vml" xmlns:wp14="http://schemas.microsoft.com/office/word/2010/wordprocessingDrawing" xmlns:wp="http://schemas.openxmlformats.org/drawingml/2006/wordprocessingDrawing" xmlns:w10="urn:schemas-microsoft-com:office:word" xmlns:w="http://schemas.openxmlformats.org/wordprocessingml/2006/main" xmlns:w14="http://schemas.microsoft.com/office/word/2010/wordml" xmlns:w15="http://schemas.microsoft.com/office/word/2012/wordml" xmlns:w16cex="http://schemas.microsoft.com/office/word/2018/wordml/cex" xmlns:w16cid="http://schemas.microsoft.com/office/word/2016/wordml/cid" xmlns:w16="http://schemas.microsoft.com/office/word/2018/wordml" xmlns:w16du="http://schemas.microsoft.com/office/word/2023/wordml/word16du" xmlns:w16sdtdh="http://schemas.microsoft.com/office/word/2020/wordml/sdtdatahash" xmlns:w16sdtfl="http://schemas.microsoft.com/office/word/2024/wordml/sdtformatlock" xmlns:w16se="http://schemas.microsoft.com/office/word/2015/wordml/symex" xmlns:wpg="http://schemas.microsoft.com/office/word/2010/wordprocessingGroup" xmlns:wpi="http://schemas.microsoft.com/office/word/2010/wordprocessingInk" xmlns:wne="http://schemas.microsoft.com/office/word/2006/wordml" xmlns:wps="http://schemas.microsoft.com/office/word/2010/wordprocessingShape" mc:Ignorable="w14 w15 w16se w16cid w16 w16cex w16sdtdh w16sdtfl w16du wp14">
   <w:footnote w:type="separator" w:id="-1">
@@ -1951,6 +2563,12 @@
     </w:p>
   </w:footnote>
 </w:footnotes>
+</file>
+
+<file path=word/header1.xml><?xml version="1.0" encoding="utf-8"?>
+<w:hdr xmlns:wpc="http://schemas.microsoft.com/office/word/2010/wordprocessingCanvas" xmlns:cx="http://schemas.microsoft.com/office/drawing/2014/chartex" xmlns:cx1="http://schemas.microsoft.com/office/drawing/2015/9/8/chartex" xmlns:cx2="http://schemas.microsoft.com/office/drawing/2015/10/21/chartex" xmlns:cx3="http://schemas.microsoft.com/office/drawing/2016/5/9/chartex" xmlns:cx4="http://schemas.microsoft.com/office/drawing/2016/5/10/chartex" xmlns:cx5="http://schemas.microsoft.com/office/drawing/2016/5/11/chartex" xmlns:cx6="http://schemas.microsoft.com/office/drawing/2016/5/12/chartex" xmlns:cx7="http://schemas.microsoft.com/office/drawing/2016/5/13/chartex" xmlns:cx8="http://schemas.microsoft.com/office/drawing/2016/5/14/chartex" xmlns:mc="http://schemas.openxmlformats.org/markup-compatibility/2006" xmlns:aink="http://schemas.microsoft.com/office/drawing/2016/ink" xmlns:am3d="http://schemas.microsoft.com/office/drawing/2017/model3d" xmlns:o="urn:schemas-microsoft-com:office:office" xmlns:oel="http://schemas.microsoft.com/office/2019/extlst" xmlns:r="http://schemas.openxmlformats.org/officeDocument/2006/relationships" xmlns:m="http://schemas.openxmlformats.org/officeDocument/2006/math" xmlns:v="urn:schemas-microsoft-com:vml" xmlns:wp14="http://schemas.microsoft.com/office/word/2010/wordprocessingDrawing" xmlns:wp="http://schemas.openxmlformats.org/drawingml/2006/wordprocessingDrawing" xmlns:w10="urn:schemas-microsoft-com:office:word" xmlns:w="http://schemas.openxmlformats.org/wordprocessingml/2006/main" xmlns:w14="http://schemas.microsoft.com/office/word/2010/wordml" xmlns:w15="http://schemas.microsoft.com/office/word/2012/wordml" xmlns:w16cex="http://schemas.microsoft.com/office/word/2018/wordml/cex" xmlns:w16cid="http://schemas.microsoft.com/office/word/2016/wordml/cid" xmlns:w16="http://schemas.microsoft.com/office/word/2018/wordml" xmlns:w16du="http://schemas.microsoft.com/office/word/2023/wordml/word16du" xmlns:w16sdtdh="http://schemas.microsoft.com/office/word/2020/wordml/sdtdatahash" xmlns:w16sdtfl="http://schemas.microsoft.com/office/word/2024/wordml/sdtformatlock" xmlns:w16se="http://schemas.microsoft.com/office/word/2015/wordml/symex" xmlns:wpg="http://schemas.microsoft.com/office/word/2010/wordprocessingGroup" xmlns:wpi="http://schemas.microsoft.com/office/word/2010/wordprocessingInk" xmlns:wne="http://schemas.microsoft.com/office/word/2006/wordml" xmlns:wps="http://schemas.microsoft.com/office/word/2010/wordprocessingShape" mc:Ignorable="w14 w15 w16se w16cid w16 w16cex w16sdtdh w16sdtfl w16du wp14">
+  <w:p/>
+</w:hdr>
 </file>
 
 <file path=word/numbering.xml><?xml version="1.0" encoding="utf-8"?>

</xml_diff>